<commit_message>
Update abstract submission Word template.
</commit_message>
<xml_diff>
--- a/public/documents/Abstract_Submission_Form.docx
+++ b/public/documents/Abstract_Submission_Form.docx
@@ -5,7 +5,146 @@
     <w:p>
       <w:pPr>
         <w:pStyle w:val="Heading1"/>
-        <w:jc w:val="center"/>
+        <w:ind w:left="1440"/>
+        <w:rPr>
+          <w:b/>
+          <w:bCs/>
+          <w:sz w:val="28"/>
+          <w:szCs w:val="28"/>
+        </w:rPr>
+      </w:pPr>
+      <w:r>
+        <w:rPr>
+          <w:b/>
+          <w:bCs/>
+          <w:noProof/>
+        </w:rPr>
+        <w:drawing>
+          <wp:anchor distT="0" distB="0" distL="114300" distR="114300" simplePos="0" relativeHeight="251658240" behindDoc="0" locked="0" layoutInCell="1" allowOverlap="1" wp14:anchorId="3824AE35" wp14:editId="25FCB1E7">
+            <wp:simplePos x="0" y="0"/>
+            <wp:positionH relativeFrom="margin">
+              <wp:posOffset>-428625</wp:posOffset>
+            </wp:positionH>
+            <wp:positionV relativeFrom="margin">
+              <wp:posOffset>-295275</wp:posOffset>
+            </wp:positionV>
+            <wp:extent cx="1003935" cy="1362710"/>
+            <wp:effectExtent l="0" t="0" r="0" b="0"/>
+            <wp:wrapSquare wrapText="bothSides"/>
+            <wp:docPr id="1904406121" name="Picture 1"/>
+            <wp:cNvGraphicFramePr>
+              <a:graphicFrameLocks xmlns:a="http://schemas.openxmlformats.org/drawingml/2006/main" noChangeAspect="1"/>
+            </wp:cNvGraphicFramePr>
+            <a:graphic xmlns:a="http://schemas.openxmlformats.org/drawingml/2006/main">
+              <a:graphicData uri="http://schemas.openxmlformats.org/drawingml/2006/picture">
+                <pic:pic xmlns:pic="http://schemas.openxmlformats.org/drawingml/2006/picture">
+                  <pic:nvPicPr>
+                    <pic:cNvPr id="1335035922" name="Picture 1335035922"/>
+                    <pic:cNvPicPr/>
+                  </pic:nvPicPr>
+                  <pic:blipFill>
+                    <a:blip r:embed="rId7" cstate="print">
+                      <a:extLst>
+                        <a:ext uri="{28A0092B-C50C-407E-A947-70E740481C1C}">
+                          <a14:useLocalDpi xmlns:a14="http://schemas.microsoft.com/office/drawing/2010/main" val="0"/>
+                        </a:ext>
+                      </a:extLst>
+                    </a:blip>
+                    <a:stretch>
+                      <a:fillRect/>
+                    </a:stretch>
+                  </pic:blipFill>
+                  <pic:spPr>
+                    <a:xfrm>
+                      <a:off x="0" y="0"/>
+                      <a:ext cx="1003935" cy="1362710"/>
+                    </a:xfrm>
+                    <a:prstGeom prst="rect">
+                      <a:avLst/>
+                    </a:prstGeom>
+                  </pic:spPr>
+                </pic:pic>
+              </a:graphicData>
+            </a:graphic>
+            <wp14:sizeRelH relativeFrom="page">
+              <wp14:pctWidth>0</wp14:pctWidth>
+            </wp14:sizeRelH>
+            <wp14:sizeRelV relativeFrom="page">
+              <wp14:pctHeight>0</wp14:pctHeight>
+            </wp14:sizeRelV>
+          </wp:anchor>
+        </w:drawing>
+      </w:r>
+      <w:r>
+        <w:rPr>
+          <w:b/>
+          <w:bCs/>
+          <w:sz w:val="28"/>
+          <w:szCs w:val="28"/>
+        </w:rPr>
+        <w:t>XI. International Congres</w:t>
+      </w:r>
+      <w:r>
+        <w:rPr>
+          <w:b/>
+          <w:bCs/>
+          <w:sz w:val="28"/>
+          <w:szCs w:val="28"/>
+        </w:rPr>
+        <w:t>s</w:t>
+      </w:r>
+      <w:r>
+        <w:rPr>
+          <w:b/>
+          <w:bCs/>
+          <w:sz w:val="28"/>
+          <w:szCs w:val="28"/>
+        </w:rPr>
+        <w:t xml:space="preserve"> of Dipterolog</w:t>
+      </w:r>
+      <w:r>
+        <w:rPr>
+          <w:b/>
+          <w:bCs/>
+          <w:sz w:val="28"/>
+          <w:szCs w:val="28"/>
+        </w:rPr>
+        <w:t>y</w:t>
+      </w:r>
+      <w:r>
+        <w:rPr>
+          <w:b/>
+          <w:bCs/>
+          <w:sz w:val="28"/>
+          <w:szCs w:val="28"/>
+        </w:rPr>
+        <w:br/>
+        <w:t>ZAGREB, CROATIA, 11 – 16 July</w:t>
+      </w:r>
+      <w:r>
+        <w:rPr>
+          <w:b/>
+          <w:bCs/>
+          <w:sz w:val="28"/>
+          <w:szCs w:val="28"/>
+        </w:rPr>
+        <w:t xml:space="preserve"> 2027</w:t>
+      </w:r>
+    </w:p>
+    <w:p>
+      <w:pPr>
+        <w:pStyle w:val="Heading1"/>
+        <w:ind w:left="1440"/>
+        <w:rPr>
+          <w:sz w:val="28"/>
+          <w:szCs w:val="28"/>
+        </w:rPr>
+      </w:pPr>
+    </w:p>
+    <w:p>
+      <w:pPr>
+        <w:pStyle w:val="Heading1"/>
+        <w:ind w:left="1440"/>
         <w:rPr>
           <w:b/>
           <w:bCs/>
@@ -199,267 +338,197 @@
           <w:color w:val="000000" w:themeColor="text1"/>
         </w:rPr>
       </w:pPr>
+      <w:sdt>
+        <w:sdtPr>
+          <w:rPr>
+            <w:rFonts w:cstheme="minorHAnsi"/>
+            <w:color w:val="000000" w:themeColor="text1"/>
+          </w:rPr>
+          <w:alias w:val="Option 1"/>
+          <w:tag w:val="Option1"/>
+          <w:id w:val="2001"/>
+          <w14:checkbox>
+            <w14:checked w14:val="0"/>
+            <w14:checkedState w14:val="2612" w14:font="MS Gothic"/>
+            <w14:uncheckedState w14:val="2610" w14:font="MS Gothic"/>
+          </w14:checkbox>
+        </w:sdtPr>
+        <w:sdtContent>
+          <w:r>
+            <w:rPr>
+              <w:rFonts w:ascii="MS Gothic" w:eastAsia="MS Gothic" w:hAnsi="MS Gothic" w:hint="eastAsia"/>
+              <w:color w:val="000000" w:themeColor="text1"/>
+            </w:rPr>
+            <w:t>☐</w:t>
+          </w:r>
+        </w:sdtContent>
+      </w:sdt>
       <w:r>
         <w:rPr>
           <w:rFonts w:cstheme="minorHAnsi"/>
           <w:color w:val="000000" w:themeColor="text1"/>
         </w:rPr>
-        <w:fldChar w:fldCharType="begin">
-          <w:ffData>
-            <w:name w:val="Check5"/>
-            <w:enabled/>
-            <w:calcOnExit w:val="0"/>
-            <w:checkBox>
-              <w:sizeAuto/>
-              <w:default w:val="0"/>
-              <w:checked w:val="0"/>
-            </w:checkBox>
-          </w:ffData>
-        </w:fldChar>
-      </w:r>
-      <w:bookmarkStart w:id="0" w:name="Check5"/>
+        <w:t xml:space="preserve"> </w:t>
+      </w:r>
       <w:r>
         <w:rPr>
           <w:rFonts w:cstheme="minorHAnsi"/>
           <w:color w:val="000000" w:themeColor="text1"/>
         </w:rPr>
-        <w:instrText xml:space="preserve"> FORMCHECKBOX </w:instrText>
-      </w:r>
-      <w:r>
+        <w:t>Poster</w:t>
+      </w:r>
+    </w:p>
+    <w:p>
+      <w:pPr>
         <w:rPr>
           <w:rFonts w:cstheme="minorHAnsi"/>
           <w:color w:val="000000" w:themeColor="text1"/>
         </w:rPr>
-      </w:r>
+      </w:pPr>
+      <w:sdt>
+        <w:sdtPr>
+          <w:rPr>
+            <w:rFonts w:cstheme="minorHAnsi"/>
+            <w:color w:val="000000" w:themeColor="text1"/>
+          </w:rPr>
+          <w:alias w:val="Option 2"/>
+          <w:tag w:val="Option2"/>
+          <w:id w:val="2002"/>
+          <w14:checkbox>
+            <w14:checked w14:val="0"/>
+            <w14:checkedState w14:val="2612" w14:font="MS Gothic"/>
+            <w14:uncheckedState w14:val="2610" w14:font="MS Gothic"/>
+          </w14:checkbox>
+        </w:sdtPr>
+        <w:sdtContent>
+          <w:r>
+            <w:rPr>
+              <w:rFonts w:ascii="MS Gothic" w:eastAsia="MS Gothic" w:hAnsi="MS Gothic" w:hint="eastAsia"/>
+              <w:color w:val="000000" w:themeColor="text1"/>
+            </w:rPr>
+            <w:t>☐</w:t>
+          </w:r>
+        </w:sdtContent>
+      </w:sdt>
       <w:r>
         <w:rPr>
           <w:rFonts w:cstheme="minorHAnsi"/>
           <w:color w:val="000000" w:themeColor="text1"/>
         </w:rPr>
-        <w:fldChar w:fldCharType="separate"/>
+        <w:t xml:space="preserve"> </w:t>
       </w:r>
       <w:r>
         <w:rPr>
           <w:rFonts w:cstheme="minorHAnsi"/>
           <w:color w:val="000000" w:themeColor="text1"/>
         </w:rPr>
-        <w:fldChar w:fldCharType="end"/>
-      </w:r>
-      <w:bookmarkEnd w:id="0"/>
-      <w:r>
-        <w:rPr>
-          <w:rFonts w:cstheme="minorHAnsi"/>
-          <w:color w:val="000000" w:themeColor="text1"/>
+        <w:t>Oral</w:t>
+      </w:r>
+    </w:p>
+    <w:p>
+      <w:pPr>
+        <w:rPr>
+          <w:rFonts w:cstheme="minorHAnsi"/>
+          <w:color w:val="1F4E79" w:themeColor="accent1" w:themeShade="80"/>
+        </w:rPr>
+      </w:pPr>
+      <w:r>
+        <w:rPr>
+          <w:rFonts w:cstheme="minorHAnsi"/>
+          <w:color w:val="1F4E79" w:themeColor="accent1" w:themeShade="80"/>
+        </w:rPr>
+        <w:t>Presenter category</w:t>
+      </w:r>
+      <w:r>
+        <w:rPr>
+          <w:rFonts w:cstheme="minorHAnsi"/>
+          <w:color w:val="1F4E79" w:themeColor="accent1" w:themeShade="80"/>
         </w:rPr>
         <w:t xml:space="preserve"> </w:t>
       </w:r>
       <w:r>
         <w:rPr>
           <w:rFonts w:cstheme="minorHAnsi"/>
-          <w:color w:val="000000" w:themeColor="text1"/>
-        </w:rPr>
-        <w:t>Poster</w:t>
-      </w:r>
-    </w:p>
-    <w:p>
-      <w:pPr>
-        <w:rPr>
-          <w:rFonts w:cstheme="minorHAnsi"/>
-          <w:color w:val="000000" w:themeColor="text1"/>
-        </w:rPr>
-      </w:pPr>
-      <w:r>
-        <w:rPr>
-          <w:rFonts w:cstheme="minorHAnsi"/>
-          <w:color w:val="000000" w:themeColor="text1"/>
-        </w:rPr>
-        <w:fldChar w:fldCharType="begin">
-          <w:ffData>
-            <w:name w:val="Check6"/>
-            <w:enabled/>
-            <w:calcOnExit w:val="0"/>
-            <w:checkBox>
-              <w:sizeAuto/>
-              <w:default w:val="0"/>
-            </w:checkBox>
-          </w:ffData>
-        </w:fldChar>
-      </w:r>
-      <w:bookmarkStart w:id="1" w:name="Check6"/>
-      <w:r>
-        <w:rPr>
-          <w:rFonts w:cstheme="minorHAnsi"/>
-          <w:color w:val="000000" w:themeColor="text1"/>
-        </w:rPr>
-        <w:instrText xml:space="preserve"> FORMCHECKBOX </w:instrText>
-      </w:r>
-      <w:r>
-        <w:rPr>
-          <w:rFonts w:cstheme="minorHAnsi"/>
-          <w:color w:val="000000" w:themeColor="text1"/>
-        </w:rPr>
-      </w:r>
-      <w:r>
-        <w:rPr>
-          <w:rFonts w:cstheme="minorHAnsi"/>
-          <w:color w:val="000000" w:themeColor="text1"/>
-        </w:rPr>
-        <w:fldChar w:fldCharType="separate"/>
-      </w:r>
-      <w:r>
-        <w:rPr>
-          <w:rFonts w:cstheme="minorHAnsi"/>
-          <w:color w:val="000000" w:themeColor="text1"/>
-        </w:rPr>
-        <w:fldChar w:fldCharType="end"/>
-      </w:r>
-      <w:bookmarkEnd w:id="1"/>
-      <w:r>
-        <w:rPr>
-          <w:rFonts w:cstheme="minorHAnsi"/>
-          <w:color w:val="000000" w:themeColor="text1"/>
+          <w:color w:val="1F4E79" w:themeColor="accent1" w:themeShade="80"/>
+        </w:rPr>
+        <w:t>(please select one option)</w:t>
+      </w:r>
+    </w:p>
+    <w:p>
+      <w:pPr>
+        <w:rPr>
+          <w:rFonts w:eastAsia="MS Gothic" w:cstheme="minorHAnsi"/>
+        </w:rPr>
+      </w:pPr>
+      <w:sdt>
+        <w:sdtPr>
+          <w:rPr>
+            <w:rFonts w:cstheme="minorHAnsi"/>
+            <w:color w:val="000000" w:themeColor="text1"/>
+          </w:rPr>
+          <w:alias w:val="Option 3"/>
+          <w:tag w:val="Option3"/>
+          <w:id w:val="2003"/>
+          <w14:checkbox>
+            <w14:checked w14:val="0"/>
+            <w14:checkedState w14:val="2612" w14:font="MS Gothic"/>
+            <w14:uncheckedState w14:val="2610" w14:font="MS Gothic"/>
+          </w14:checkbox>
+        </w:sdtPr>
+        <w:sdtContent>
+          <w:r>
+            <w:rPr>
+              <w:rFonts w:ascii="MS Gothic" w:eastAsia="MS Gothic" w:hAnsi="MS Gothic" w:hint="eastAsia"/>
+              <w:color w:val="000000" w:themeColor="text1"/>
+            </w:rPr>
+            <w:t>☐</w:t>
+          </w:r>
+        </w:sdtContent>
+      </w:sdt>
+      <w:r>
+        <w:rPr>
+          <w:rFonts w:eastAsia="MS Gothic" w:cstheme="minorHAnsi"/>
         </w:rPr>
         <w:t xml:space="preserve"> </w:t>
       </w:r>
       <w:r>
         <w:rPr>
-          <w:rFonts w:cstheme="minorHAnsi"/>
-          <w:color w:val="000000" w:themeColor="text1"/>
-        </w:rPr>
-        <w:t>Oral</w:t>
-      </w:r>
-    </w:p>
-    <w:p>
-      <w:pPr>
-        <w:rPr>
-          <w:rFonts w:cstheme="minorHAnsi"/>
-          <w:color w:val="1F4E79" w:themeColor="accent1" w:themeShade="80"/>
-        </w:rPr>
-      </w:pPr>
-      <w:r>
-        <w:rPr>
-          <w:rFonts w:cstheme="minorHAnsi"/>
-          <w:color w:val="1F4E79" w:themeColor="accent1" w:themeShade="80"/>
-        </w:rPr>
-        <w:t>Presenter category</w:t>
-      </w:r>
-      <w:r>
-        <w:rPr>
-          <w:rFonts w:cstheme="minorHAnsi"/>
-          <w:color w:val="1F4E79" w:themeColor="accent1" w:themeShade="80"/>
-        </w:rPr>
-        <w:t xml:space="preserve"> (please select one option)</w:t>
-      </w:r>
-    </w:p>
-    <w:p>
-      <w:pPr>
-        <w:rPr>
           <w:rFonts w:eastAsia="MS Gothic" w:cstheme="minorHAnsi"/>
         </w:rPr>
-      </w:pPr>
-      <w:r>
+        <w:t>Regular</w:t>
+      </w:r>
+    </w:p>
+    <w:p>
+      <w:pPr>
         <w:rPr>
           <w:rFonts w:eastAsia="MS Gothic" w:cstheme="minorHAnsi"/>
         </w:rPr>
-        <w:fldChar w:fldCharType="begin">
-          <w:ffData>
-            <w:name w:val="Check1"/>
-            <w:enabled/>
-            <w:calcOnExit w:val="0"/>
-            <w:checkBox>
-              <w:sizeAuto/>
-              <w:default w:val="0"/>
-              <w:checked w:val="0"/>
-            </w:checkBox>
-          </w:ffData>
-        </w:fldChar>
-      </w:r>
-      <w:bookmarkStart w:id="2" w:name="Check1"/>
-      <w:r>
-        <w:rPr>
-          <w:rFonts w:eastAsia="MS Gothic" w:cstheme="minorHAnsi"/>
-        </w:rPr>
-        <w:instrText xml:space="preserve"> FORMCHECKBOX </w:instrText>
-      </w:r>
-      <w:r>
-        <w:rPr>
-          <w:rFonts w:eastAsia="MS Gothic" w:cstheme="minorHAnsi"/>
-        </w:rPr>
-      </w:r>
-      <w:r>
-        <w:rPr>
-          <w:rFonts w:eastAsia="MS Gothic" w:cstheme="minorHAnsi"/>
-        </w:rPr>
-        <w:fldChar w:fldCharType="separate"/>
-      </w:r>
-      <w:r>
-        <w:rPr>
-          <w:rFonts w:eastAsia="MS Gothic" w:cstheme="minorHAnsi"/>
-        </w:rPr>
-        <w:fldChar w:fldCharType="end"/>
-      </w:r>
-      <w:bookmarkEnd w:id="2"/>
-      <w:r>
-        <w:rPr>
-          <w:rFonts w:eastAsia="MS Gothic" w:cstheme="minorHAnsi"/>
-        </w:rPr>
-        <w:t xml:space="preserve"> </w:t>
-      </w:r>
-      <w:r>
-        <w:rPr>
-          <w:rFonts w:eastAsia="MS Gothic" w:cstheme="minorHAnsi"/>
-        </w:rPr>
-        <w:t>Regular</w:t>
-      </w:r>
-    </w:p>
-    <w:p>
-      <w:pPr>
-        <w:rPr>
-          <w:rFonts w:eastAsia="MS Gothic" w:cstheme="minorHAnsi"/>
-        </w:rPr>
-      </w:pPr>
-      <w:r>
-        <w:rPr>
-          <w:rFonts w:eastAsia="MS Gothic" w:cstheme="minorHAnsi"/>
-        </w:rPr>
-        <w:fldChar w:fldCharType="begin">
-          <w:ffData>
-            <w:name w:val="Check2"/>
-            <w:enabled/>
-            <w:calcOnExit w:val="0"/>
-            <w:checkBox>
-              <w:sizeAuto/>
-              <w:default w:val="0"/>
-              <w:checked w:val="0"/>
-            </w:checkBox>
-          </w:ffData>
-        </w:fldChar>
-      </w:r>
-      <w:bookmarkStart w:id="3" w:name="Check2"/>
-      <w:r>
-        <w:rPr>
-          <w:rFonts w:eastAsia="MS Gothic" w:cstheme="minorHAnsi"/>
-        </w:rPr>
-        <w:instrText xml:space="preserve"> FORMCHECKBOX </w:instrText>
-      </w:r>
-      <w:r>
-        <w:rPr>
-          <w:rFonts w:eastAsia="MS Gothic" w:cstheme="minorHAnsi"/>
-        </w:rPr>
-      </w:r>
-      <w:r>
-        <w:rPr>
-          <w:rFonts w:eastAsia="MS Gothic" w:cstheme="minorHAnsi"/>
-        </w:rPr>
-        <w:fldChar w:fldCharType="separate"/>
-      </w:r>
-      <w:r>
-        <w:rPr>
-          <w:rFonts w:eastAsia="MS Gothic" w:cstheme="minorHAnsi"/>
-        </w:rPr>
-        <w:fldChar w:fldCharType="end"/>
-      </w:r>
-      <w:bookmarkEnd w:id="3"/>
+      </w:pPr>
+      <w:sdt>
+        <w:sdtPr>
+          <w:rPr>
+            <w:rFonts w:cstheme="minorHAnsi"/>
+            <w:color w:val="000000" w:themeColor="text1"/>
+          </w:rPr>
+          <w:alias w:val="Option 4"/>
+          <w:tag w:val="Option4"/>
+          <w:id w:val="2004"/>
+          <w14:checkbox>
+            <w14:checked w14:val="0"/>
+            <w14:checkedState w14:val="2612" w14:font="MS Gothic"/>
+            <w14:uncheckedState w14:val="2610" w14:font="MS Gothic"/>
+          </w14:checkbox>
+        </w:sdtPr>
+        <w:sdtContent>
+          <w:r>
+            <w:rPr>
+              <w:rFonts w:ascii="MS Gothic" w:eastAsia="MS Gothic" w:hAnsi="MS Gothic" w:hint="eastAsia"/>
+              <w:color w:val="000000" w:themeColor="text1"/>
+            </w:rPr>
+            <w:t>☐</w:t>
+          </w:r>
+        </w:sdtContent>
+      </w:sdt>
       <w:r>
         <w:rPr>
           <w:rFonts w:eastAsia="MS Gothic" w:cstheme="minorHAnsi"/>
@@ -532,253 +601,164 @@
           <w:szCs w:val="20"/>
         </w:rPr>
       </w:pPr>
+      <w:sdt>
+        <w:sdtPr>
+          <w:rPr>
+            <w:rFonts w:cstheme="minorHAnsi"/>
+            <w:color w:val="000000" w:themeColor="text1"/>
+          </w:rPr>
+          <w:alias w:val="Option 5"/>
+          <w:tag w:val="Option5"/>
+          <w:id w:val="2005"/>
+          <w14:checkbox>
+            <w14:checked w14:val="0"/>
+            <w14:checkedState w14:val="2612" w14:font="MS Gothic"/>
+            <w14:uncheckedState w14:val="2610" w14:font="MS Gothic"/>
+          </w14:checkbox>
+        </w:sdtPr>
+        <w:sdtContent>
+          <w:r>
+            <w:rPr>
+              <w:rFonts w:ascii="MS Gothic" w:eastAsia="MS Gothic" w:hAnsi="MS Gothic" w:hint="eastAsia"/>
+              <w:color w:val="000000" w:themeColor="text1"/>
+            </w:rPr>
+            <w:t>☐</w:t>
+          </w:r>
+        </w:sdtContent>
+      </w:sdt>
       <w:r>
         <w:rPr>
           <w:rFonts w:cstheme="minorHAnsi"/>
           <w:sz w:val="20"/>
           <w:szCs w:val="20"/>
         </w:rPr>
-        <w:fldChar w:fldCharType="begin">
-          <w:ffData>
-            <w:name w:val="Check3"/>
-            <w:enabled/>
-            <w:calcOnExit w:val="0"/>
-            <w:checkBox>
-              <w:sizeAuto/>
-              <w:default w:val="0"/>
-              <w:checked w:val="0"/>
-            </w:checkBox>
-          </w:ffData>
-        </w:fldChar>
-      </w:r>
-      <w:bookmarkStart w:id="4" w:name="Check3"/>
+        <w:t xml:space="preserve"> </w:t>
+      </w:r>
+      <w:r>
+        <w:rPr>
+          <w:rFonts w:cstheme="minorHAnsi"/>
+        </w:rPr>
+        <w:t>Yes</w:t>
+      </w:r>
+    </w:p>
+    <w:p>
+      <w:pPr>
+        <w:rPr>
+          <w:rFonts w:cstheme="minorHAnsi"/>
+        </w:rPr>
+      </w:pPr>
+      <w:sdt>
+        <w:sdtPr>
+          <w:rPr>
+            <w:rFonts w:cstheme="minorHAnsi"/>
+            <w:color w:val="000000" w:themeColor="text1"/>
+          </w:rPr>
+          <w:alias w:val="Option 6"/>
+          <w:tag w:val="Option6"/>
+          <w:id w:val="2006"/>
+          <w14:checkbox>
+            <w14:checked w14:val="0"/>
+            <w14:checkedState w14:val="2612" w14:font="MS Gothic"/>
+            <w14:uncheckedState w14:val="2610" w14:font="MS Gothic"/>
+          </w14:checkbox>
+        </w:sdtPr>
+        <w:sdtContent>
+          <w:r>
+            <w:rPr>
+              <w:rFonts w:ascii="MS Gothic" w:eastAsia="MS Gothic" w:hAnsi="MS Gothic" w:hint="eastAsia"/>
+              <w:color w:val="000000" w:themeColor="text1"/>
+            </w:rPr>
+            <w:t>☐</w:t>
+          </w:r>
+        </w:sdtContent>
+      </w:sdt>
       <w:r>
         <w:rPr>
           <w:rFonts w:cstheme="minorHAnsi"/>
           <w:sz w:val="20"/>
           <w:szCs w:val="20"/>
         </w:rPr>
-        <w:instrText xml:space="preserve"> FORMCHECKBOX </w:instrText>
-      </w:r>
-      <w:r>
-        <w:rPr>
-          <w:rFonts w:cstheme="minorHAnsi"/>
+        <w:t xml:space="preserve"> </w:t>
+      </w:r>
+      <w:r>
+        <w:rPr>
+          <w:rFonts w:cstheme="minorHAnsi"/>
+        </w:rPr>
+        <w:t>No</w:t>
+      </w:r>
+    </w:p>
+    <w:p>
+      <w:pPr>
+        <w:rPr>
+          <w:rFonts w:cstheme="minorHAnsi"/>
+          <w:b/>
+          <w:bCs/>
+          <w:color w:val="1F4E79" w:themeColor="accent1" w:themeShade="80"/>
+        </w:rPr>
+      </w:pPr>
+      <w:r>
+        <w:rPr>
+          <w:rFonts w:cstheme="minorHAnsi"/>
+          <w:b/>
+          <w:bCs/>
+          <w:color w:val="1F4E79" w:themeColor="accent1" w:themeShade="80"/>
+        </w:rPr>
+        <w:t xml:space="preserve">Choose symposia: </w:t>
+      </w:r>
+    </w:p>
+    <w:permStart w:id="6" w:edGrp="everyone"/>
+    <w:p>
+      <w:pPr>
+        <w:rPr>
+          <w:rFonts w:eastAsia="MS Gothic" w:cstheme="minorHAnsi"/>
           <w:sz w:val="20"/>
           <w:szCs w:val="20"/>
         </w:rPr>
-      </w:r>
-      <w:r>
-        <w:rPr>
-          <w:rFonts w:cstheme="minorHAnsi"/>
-          <w:sz w:val="20"/>
-          <w:szCs w:val="20"/>
-        </w:rPr>
-        <w:fldChar w:fldCharType="separate"/>
-      </w:r>
-      <w:r>
-        <w:rPr>
-          <w:rFonts w:cstheme="minorHAnsi"/>
-          <w:sz w:val="20"/>
-          <w:szCs w:val="20"/>
-        </w:rPr>
-        <w:fldChar w:fldCharType="end"/>
-      </w:r>
-      <w:bookmarkEnd w:id="4"/>
-      <w:r>
-        <w:rPr>
-          <w:rFonts w:cstheme="minorHAnsi"/>
-          <w:sz w:val="20"/>
-          <w:szCs w:val="20"/>
-        </w:rPr>
-        <w:t xml:space="preserve"> </w:t>
-      </w:r>
-      <w:r>
-        <w:rPr>
-          <w:rFonts w:cstheme="minorHAnsi"/>
-        </w:rPr>
-        <w:t>Yes</w:t>
-      </w:r>
-    </w:p>
-    <w:p>
-      <w:pPr>
-        <w:rPr>
-          <w:rFonts w:cstheme="minorHAnsi"/>
-        </w:rPr>
-      </w:pPr>
-      <w:r>
-        <w:rPr>
-          <w:rFonts w:cstheme="minorHAnsi"/>
-          <w:sz w:val="20"/>
-          <w:szCs w:val="20"/>
-        </w:rPr>
-        <w:fldChar w:fldCharType="begin">
-          <w:ffData>
-            <w:name w:val="Check4"/>
-            <w:enabled/>
-            <w:calcOnExit w:val="0"/>
-            <w:checkBox>
-              <w:sizeAuto/>
-              <w:default w:val="0"/>
-              <w:checked w:val="0"/>
-            </w:checkBox>
-          </w:ffData>
-        </w:fldChar>
-      </w:r>
-      <w:bookmarkStart w:id="5" w:name="Check4"/>
-      <w:r>
-        <w:rPr>
-          <w:rFonts w:cstheme="minorHAnsi"/>
-          <w:sz w:val="20"/>
-          <w:szCs w:val="20"/>
-        </w:rPr>
-        <w:instrText xml:space="preserve"> FORMCHECKBOX </w:instrText>
-      </w:r>
-      <w:r>
-        <w:rPr>
-          <w:rFonts w:cstheme="minorHAnsi"/>
-          <w:sz w:val="20"/>
-          <w:szCs w:val="20"/>
-        </w:rPr>
-      </w:r>
-      <w:r>
-        <w:rPr>
-          <w:rFonts w:cstheme="minorHAnsi"/>
-          <w:sz w:val="20"/>
-          <w:szCs w:val="20"/>
-        </w:rPr>
-        <w:fldChar w:fldCharType="separate"/>
-      </w:r>
-      <w:r>
-        <w:rPr>
-          <w:rFonts w:cstheme="minorHAnsi"/>
-          <w:sz w:val="20"/>
-          <w:szCs w:val="20"/>
-        </w:rPr>
-        <w:fldChar w:fldCharType="end"/>
-      </w:r>
-      <w:bookmarkEnd w:id="5"/>
-      <w:r>
-        <w:rPr>
-          <w:rFonts w:cstheme="minorHAnsi"/>
-          <w:sz w:val="20"/>
-          <w:szCs w:val="20"/>
-        </w:rPr>
-        <w:t xml:space="preserve"> </w:t>
-      </w:r>
-      <w:r>
-        <w:rPr>
-          <w:rFonts w:cstheme="minorHAnsi"/>
-        </w:rPr>
-        <w:t>No</w:t>
-      </w:r>
-    </w:p>
-    <w:p>
-      <w:pPr>
-        <w:rPr>
-          <w:rFonts w:cstheme="minorHAnsi"/>
-          <w:b/>
-          <w:bCs/>
-          <w:color w:val="1F4E79" w:themeColor="accent1" w:themeShade="80"/>
-        </w:rPr>
-      </w:pPr>
-      <w:r>
-        <w:rPr>
-          <w:rFonts w:cstheme="minorHAnsi"/>
-          <w:b/>
-          <w:bCs/>
-          <w:color w:val="1F4E79" w:themeColor="accent1" w:themeShade="80"/>
-        </w:rPr>
-        <w:t>S</w:t>
-      </w:r>
-      <w:r>
-        <w:rPr>
-          <w:rFonts w:cstheme="minorHAnsi"/>
-          <w:b/>
-          <w:bCs/>
-          <w:color w:val="1F4E79" w:themeColor="accent1" w:themeShade="80"/>
-        </w:rPr>
-        <w:t>ymposi</w:t>
-      </w:r>
-      <w:r>
-        <w:rPr>
-          <w:rFonts w:cstheme="minorHAnsi"/>
-          <w:b/>
-          <w:bCs/>
-          <w:color w:val="1F4E79" w:themeColor="accent1" w:themeShade="80"/>
-        </w:rPr>
-        <w:t>um</w:t>
-      </w:r>
-      <w:r>
-        <w:rPr>
-          <w:rFonts w:cstheme="minorHAnsi"/>
-          <w:b/>
-          <w:bCs/>
-          <w:color w:val="1F4E79" w:themeColor="accent1" w:themeShade="80"/>
-        </w:rPr>
-        <w:t xml:space="preserve">: </w:t>
-      </w:r>
-    </w:p>
-    <w:sdt>
-      <w:sdtPr>
-        <w:rPr>
-          <w:rFonts w:cstheme="minorHAnsi"/>
-          <w:b/>
-          <w:bCs/>
-          <w:color w:val="1F4E79" w:themeColor="accent1" w:themeShade="80"/>
-        </w:rPr>
-        <w:tag w:val="Symposium"/>
-        <w:id w:val="1252549674"/>
-        <w:placeholder>
-          <w:docPart w:val="DefaultPlaceholder_-1854013438"/>
-        </w:placeholder>
-        <w:dropDownList>
-          <w:listItem w:displayText="Select symposium" w:value="Select symposium"/>
-          <w:listItem w:displayText="Acalyptratae" w:value="Acalyptratae"/>
-          <w:listItem w:displayText="Advances in Afrotropical Dipterology" w:value="Advances in Afrotropical Dipterology"/>
-          <w:listItem w:displayText="Advances in Automated Diptera Identification and Monitoring" w:value="Advances in Automated Diptera Identification and Monitoring"/>
-          <w:listItem w:displayText="Applied Dipterology" w:value="Applied Dipterology"/>
-          <w:listItem w:displayText="Asiloidea" w:value="Asiloidea"/>
-          <w:listItem w:displayText="Bibionomorpha Systematics, Diversity and Ecology" w:value="Bibionomorpha Systematics, Diversity and Ecology"/>
-          <w:listItem w:displayText="Biodiversity surveys and conservation" w:value="Biodiversity surveys and conservation"/>
-          <w:listItem w:displayText="Calyptrate systematics and diversity" w:value="Calyptrate systematics and diversity"/>
-          <w:listItem w:displayText="Culicomorpha" w:value="Culicomorpha"/>
-          <w:listItem w:displayText="Deep time Dipterology" w:value="Deep time Dipterology"/>
-          <w:listItem w:displayText="Diptera as pollinators" w:value="Diptera as pollinators"/>
-          <w:listItem w:displayText="Diptera ecology and behaviour" w:value="Diptera ecology and behaviour"/>
-          <w:listItem w:displayText="Diptera in Forensic Entomology" w:value="Diptera in Forensic Entomology"/>
-          <w:listItem w:displayText="Empidoidea" w:value="Empidoidea"/>
-          <w:listItem w:displayText="Integrative taxonomy and vertical stratification of the fly fauna" w:value="Integrative taxonomy and vertical stratification of the fly fauna"/>
-          <w:listItem w:displayText="Lower Cyclorrhapha" w:value="Lower Cyclorrhapha"/>
-          <w:listItem w:displayText="Medical and Veterinary Diptera" w:value="Medical and Veterinary Diptera"/>
-          <w:listItem w:displayText="Phylogenomics" w:value="Phylogenomics"/>
-          <w:listItem w:displayText="Psychodomorpha" w:value="Psychodomorpha"/>
-          <w:listItem w:displayText="Taxonomy and ecology of lower Brachycera" w:value="Taxonomy and ecology of lower Brachycera"/>
-          <w:listItem w:displayText="Tipulomorpha &amp; Ptychopteromorpha" w:value="Tipulomorpha &amp; Ptychopteromorpha"/>
-          <w:listItem w:displayText="General" w:value="General"/>
-        </w:dropDownList>
-      </w:sdtPr>
-      <w:sdtContent>
-        <w:p>
-          <w:pPr>
-            <w:rPr>
-              <w:rFonts w:cstheme="minorHAnsi"/>
-              <w:b/>
-              <w:bCs/>
-              <w:color w:val="1F4E79" w:themeColor="accent1" w:themeShade="80"/>
-            </w:rPr>
-          </w:pPr>
+      </w:pPr>
+      <w:sdt>
+        <w:sdtPr>
+          <w:rPr>
+            <w:rFonts w:cstheme="minorHAnsi"/>
+          </w:rPr>
+          <w:alias w:val="Choose symposia"/>
+          <w:tag w:val="Choose symposia"/>
+          <w:id w:val="1005"/>
+          <w:showingPlcHdr/>
+          <w:dropDownList>
+            <w:listItem w:displayText="Choose a symposium" w:value=""/>
+            <w:listItem w:displayText="Acalyptratae" w:value="Acalyptratae"/>
+            <w:listItem w:displayText="Advances in Afrotropical Dipterology" w:value="Advances in Afrotropical Dipterology"/>
+            <w:listItem w:displayText="Applied Dipterology" w:value="Applied Dipterology"/>
+            <w:listItem w:displayText="Biodiversity surveys and conservation" w:value="Biodiversity surveys and conservation"/>
+            <w:listItem w:displayText="Calyptrate systematics and diversity" w:value="Calyptrate systematics and diversity"/>
+            <w:listItem w:displayText="Culicomorpha" w:value="Culicomorpha"/>
+            <w:listItem w:displayText="Empidoidea" w:value="Empidoidea"/>
+            <w:listItem w:displayText="Lower Cyclorrhapha" w:value="Lower Cyclorrhapha"/>
+            <w:listItem w:displayText="Psychodomorpha" w:value="Psychodomorpha"/>
+            <w:listItem w:displayText="Tipulomorpha &amp; Ptychopteromorpha" w:value="Tipulomorpha &amp; Ptychopteromorpha"/>
+            <w:listItem w:displayText="Integrative taxonomy and vertical stratification of the fly fauna" w:value="Integrative taxonomy and vertical stratification of the fly fauna"/>
+            <w:listItem w:displayText="Deep time Dipterology" w:value="Deep time Dipterology"/>
+            <w:listItem w:displayText="Phylogenomics" w:value="Phylogenomics"/>
+            <w:listItem w:displayText="Taxonomy and ecology of lower Brachycera" w:value="Taxonomy and ecology of lower Brachycera"/>
+            <w:listItem w:displayText="Diptera in Forensic Entomology" w:value="Diptera in Forensic Entomology"/>
+            <w:listItem w:displayText="Medical and Veterinary Diptera" w:value="Medical and Veterinary Diptera"/>
+            <w:listItem w:displayText="Advances in Automated Diptera Identification and Monitoring" w:value="Advances in Automated Diptera Identification and Monitoring"/>
+            <w:listItem w:displayText="Diptera ecology and behaviour" w:value="Diptera ecology and behaviour"/>
+            <w:listItem w:displayText="Bibionomorpha Systematics, Diversity and Ecology" w:value="Bibionomorpha Systematics, Diversity and Ecology"/>
+            <w:listItem w:displayText="General" w:value="General"/>
+          </w:dropDownList>
+        </w:sdtPr>
+        <w:sdtContent>
           <w:r>
             <w:rPr>
               <w:rFonts w:cstheme="minorHAnsi"/>
-              <w:b/>
-              <w:bCs/>
-              <w:color w:val="1F4E79" w:themeColor="accent1" w:themeShade="80"/>
             </w:rPr>
-            <w:t>Select symposium</w:t>
+            <w:t>Choose a symposium</w:t>
           </w:r>
-        </w:p>
-      </w:sdtContent>
-    </w:sdt>
+        </w:sdtContent>
+      </w:sdt>
+      <w:permEnd w:id="6"/>
+    </w:p>
     <w:p>
       <w:pPr>
         <w:rPr>
@@ -819,6 +799,8 @@
           <w:alias w:val="Abstract title"/>
           <w:tag w:val="Abstract title"/>
           <w:id w:val="1006"/>
+          <w:showingPlcHdr/>
+          <w:richText/>
         </w:sdtPr>
         <w:sdtContent>
           <w:r>
@@ -852,6 +834,8 @@
           <w:alias w:val="Keywords"/>
           <w:tag w:val="Keywords"/>
           <w:id w:val="1007"/>
+          <w:showingPlcHdr/>
+          <w:richText/>
         </w:sdtPr>
         <w:sdtContent>
           <w:r>
@@ -885,6 +869,8 @@
           <w:alias w:val="Author names"/>
           <w:tag w:val="Author names"/>
           <w:id w:val="1008"/>
+          <w:showingPlcHdr/>
+          <w:richText/>
         </w:sdtPr>
         <w:sdtContent>
           <w:r>
@@ -918,6 +904,8 @@
           <w:alias w:val="Author addresses"/>
           <w:tag w:val="Author addresses"/>
           <w:id w:val="1009"/>
+          <w:showingPlcHdr/>
+          <w:richText/>
         </w:sdtPr>
         <w:sdtContent>
           <w:r>
@@ -932,6 +920,25 @@
     </w:p>
     <w:p>
       <w:pPr>
+        <w:spacing w:before="120" w:after="60"/>
+        <w:rPr>
+          <w:i/>
+          <w:sz w:val="18"/>
+          <w:lang w:val="en-GB"/>
+        </w:rPr>
+      </w:pPr>
+      <w:r>
+        <w:rPr>
+          <w:i/>
+          <w:color w:val="595959"/>
+          <w:sz w:val="18"/>
+          <w:lang w:val="en-GB"/>
+        </w:rPr>
+        <w:t>Paste with Keep Source Formatting. Italics (e.g. species names) must remain visible after pasting. Please check before submitting.</w:t>
+      </w:r>
+    </w:p>
+    <w:p>
+      <w:pPr>
         <w:rPr>
           <w:rFonts w:cstheme="minorHAnsi"/>
         </w:rPr>
@@ -945,22 +952,14 @@
       <w:r>
         <w:rPr>
           <w:rFonts w:cstheme="minorHAnsi"/>
-          <w:color w:val="EE0000"/>
         </w:rPr>
         <w:t>2000</w:t>
       </w:r>
       <w:r>
         <w:rPr>
           <w:rFonts w:cstheme="minorHAnsi"/>
-          <w:color w:val="EE0000"/>
-        </w:rPr>
-        <w:t xml:space="preserve"> </w:t>
-      </w:r>
-      <w:r>
-        <w:rPr>
-          <w:rFonts w:cstheme="minorHAnsi"/>
-        </w:rPr>
-        <w:t xml:space="preserve">characters including spaces): </w:t>
+        </w:rPr>
+        <w:t xml:space="preserve"> characters including spaces): </w:t>
       </w:r>
       <w:permStart w:id="11" w:edGrp="everyone"/>
       <w:sdt>
@@ -971,6 +970,8 @@
           <w:alias w:val="Abstract text"/>
           <w:tag w:val="Abstract text"/>
           <w:id w:val="1010"/>
+          <w:showingPlcHdr/>
+          <w:richText/>
         </w:sdtPr>
         <w:sdtContent>
           <w:r>
@@ -999,9 +1000,8 @@
       </w:pPr>
     </w:p>
     <w:sectPr>
-      <w:headerReference w:type="default" r:id="rId7"/>
       <w:pgSz w:w="11907" w:h="16840" w:code="9"/>
-      <w:pgMar w:top="568" w:right="1417" w:bottom="1417" w:left="1417" w:header="1008" w:footer="432" w:gutter="0"/>
+      <w:pgMar w:top="568" w:right="1417" w:bottom="1417" w:left="1417" w:header="0" w:footer="432" w:gutter="0"/>
       <w:cols w:space="708"/>
       <w:docGrid w:linePitch="360"/>
     </w:sectPr>
@@ -1057,111 +1057,6 @@
     </w:p>
   </w:footnote>
 </w:footnotes>
-</file>
-
-<file path=word/header1.xml><?xml version="1.0" encoding="utf-8"?>
-<w:hdr xmlns:wpc="http://schemas.microsoft.com/office/word/2010/wordprocessingCanvas" xmlns:cx="http://schemas.microsoft.com/office/drawing/2014/chartex" xmlns:cx1="http://schemas.microsoft.com/office/drawing/2015/9/8/chartex" xmlns:cx2="http://schemas.microsoft.com/office/drawing/2015/10/21/chartex" xmlns:cx3="http://schemas.microsoft.com/office/drawing/2016/5/9/chartex" xmlns:cx4="http://schemas.microsoft.com/office/drawing/2016/5/10/chartex" xmlns:cx5="http://schemas.microsoft.com/office/drawing/2016/5/11/chartex" xmlns:cx6="http://schemas.microsoft.com/office/drawing/2016/5/12/chartex" xmlns:cx7="http://schemas.microsoft.com/office/drawing/2016/5/13/chartex" xmlns:cx8="http://schemas.microsoft.com/office/drawing/2016/5/14/chartex" xmlns:mc="http://schemas.openxmlformats.org/markup-compatibility/2006" xmlns:m="http://schemas.openxmlformats.org/officeDocument/2006/math" xmlns:aink="http://schemas.microsoft.com/office/drawing/2016/ink" xmlns:am3d="http://schemas.microsoft.com/office/drawing/2017/model3d" xmlns:oel="http://schemas.microsoft.com/office/2019/extlst" xmlns:r="http://schemas.openxmlformats.org/officeDocument/2006/relationships" xmlns:wp14="http://schemas.microsoft.com/office/word/2010/wordprocessingDrawing" xmlns:wp="http://schemas.openxmlformats.org/drawingml/2006/wordprocessingDrawing" xmlns:wpg="http://schemas.microsoft.com/office/word/2010/wordprocessingGroup" xmlns:wpi="http://schemas.microsoft.com/office/word/2010/wordprocessingInk" xmlns:wps="http://schemas.microsoft.com/office/word/2010/wordprocessingShape" xmlns:o="urn:schemas-microsoft-com:office:office" xmlns:v="urn:schemas-microsoft-com:vml" xmlns:w10="urn:schemas-microsoft-com:office:word" xmlns:w="http://schemas.openxmlformats.org/wordprocessingml/2006/main" xmlns:w14="http://schemas.microsoft.com/office/word/2010/wordml" xmlns:w15="http://schemas.microsoft.com/office/word/2012/wordml" xmlns:w16cex="http://schemas.microsoft.com/office/word/2018/wordml/cex" xmlns:w16cid="http://schemas.microsoft.com/office/word/2016/wordml/cid" xmlns:w16="http://schemas.microsoft.com/office/word/2018/wordml" xmlns:w16sdtdh="http://schemas.microsoft.com/office/word/2020/wordml/sdtdatahash" xmlns:w16sdtfl="http://schemas.microsoft.com/office/word/2024/wordml/sdtformatlock" xmlns:w16se="http://schemas.microsoft.com/office/word/2015/wordml/symex" xmlns:w16du="http://schemas.microsoft.com/office/word/2023/wordml/word16du" xmlns:wne="http://schemas.microsoft.com/office/word/2006/wordml" mc:Ignorable="w14 w15 w16se w16cid w16 w16cex w16sdtdh w16sdtfl w16du wp14">
-  <w:p>
-    <w:pPr>
-      <w:pStyle w:val="Heading1"/>
-      <w:ind w:left="1440"/>
-      <w:rPr>
-        <w:rFonts w:ascii="Calibri" w:hAnsi="Calibri" w:cs="Calibri"/>
-        <w:color w:val="657C9C" w:themeColor="text2" w:themeTint="BF"/>
-        <w:sz w:val="28"/>
-        <w:szCs w:val="28"/>
-      </w:rPr>
-    </w:pPr>
-    <w:r>
-      <w:rPr>
-        <w:rFonts w:ascii="Calibri" w:hAnsi="Calibri" w:cs="Calibri"/>
-        <w:noProof/>
-      </w:rPr>
-      <w:drawing>
-        <wp:anchor distT="0" distB="0" distL="114300" distR="114300" simplePos="0" relativeHeight="251659264" behindDoc="0" locked="0" layoutInCell="1" allowOverlap="1" wp14:anchorId="01BA59F3" wp14:editId="0B51CC53">
-          <wp:simplePos x="0" y="0"/>
-          <wp:positionH relativeFrom="margin">
-            <wp:posOffset>-471170</wp:posOffset>
-          </wp:positionH>
-          <wp:positionV relativeFrom="margin">
-            <wp:posOffset>-1461770</wp:posOffset>
-          </wp:positionV>
-          <wp:extent cx="958215" cy="1301115"/>
-          <wp:effectExtent l="0" t="0" r="0" b="0"/>
-          <wp:wrapSquare wrapText="bothSides"/>
-          <wp:docPr id="1904406121" name="Picture 1"/>
-          <wp:cNvGraphicFramePr>
-            <a:graphicFrameLocks xmlns:a="http://schemas.openxmlformats.org/drawingml/2006/main" noChangeAspect="1"/>
-          </wp:cNvGraphicFramePr>
-          <a:graphic xmlns:a="http://schemas.openxmlformats.org/drawingml/2006/main">
-            <a:graphicData uri="http://schemas.openxmlformats.org/drawingml/2006/picture">
-              <pic:pic xmlns:pic="http://schemas.openxmlformats.org/drawingml/2006/picture">
-                <pic:nvPicPr>
-                  <pic:cNvPr id="1335035922" name="Picture 1335035922"/>
-                  <pic:cNvPicPr/>
-                </pic:nvPicPr>
-                <pic:blipFill>
-                  <a:blip r:embed="rId1" cstate="print">
-                    <a:extLst>
-                      <a:ext uri="{28A0092B-C50C-407E-A947-70E740481C1C}">
-                        <a14:useLocalDpi xmlns:a14="http://schemas.microsoft.com/office/drawing/2010/main" val="0"/>
-                      </a:ext>
-                    </a:extLst>
-                  </a:blip>
-                  <a:stretch>
-                    <a:fillRect/>
-                  </a:stretch>
-                </pic:blipFill>
-                <pic:spPr>
-                  <a:xfrm>
-                    <a:off x="0" y="0"/>
-                    <a:ext cx="958215" cy="1301115"/>
-                  </a:xfrm>
-                  <a:prstGeom prst="rect">
-                    <a:avLst/>
-                  </a:prstGeom>
-                </pic:spPr>
-              </pic:pic>
-            </a:graphicData>
-          </a:graphic>
-          <wp14:sizeRelH relativeFrom="page">
-            <wp14:pctWidth>0</wp14:pctWidth>
-          </wp14:sizeRelH>
-          <wp14:sizeRelV relativeFrom="page">
-            <wp14:pctHeight>0</wp14:pctHeight>
-          </wp14:sizeRelV>
-        </wp:anchor>
-      </w:drawing>
-    </w:r>
-    <w:r>
-      <w:rPr>
-        <w:rFonts w:ascii="Calibri" w:hAnsi="Calibri" w:cs="Calibri"/>
-        <w:sz w:val="28"/>
-        <w:szCs w:val="28"/>
-      </w:rPr>
-      <w:t>XI. International Congress of Dipterology</w:t>
-    </w:r>
-    <w:r>
-      <w:rPr>
-        <w:rFonts w:ascii="Calibri" w:hAnsi="Calibri" w:cs="Calibri"/>
-        <w:sz w:val="28"/>
-        <w:szCs w:val="28"/>
-      </w:rPr>
-      <w:br/>
-      <w:t>ZAGREB, CROATIA, 11 – 16 July 2027</w:t>
-    </w:r>
-  </w:p>
-  <w:p>
-    <w:pPr>
-      <w:pStyle w:val="Header"/>
-    </w:pPr>
-  </w:p>
-  <w:p>
-    <w:pPr>
-      <w:pStyle w:val="Header"/>
-    </w:pPr>
-  </w:p>
-</w:hdr>
 </file>
 
 <file path=word/styles.xml><?xml version="1.0" encoding="utf-8"?>
@@ -1897,594 +1792,7 @@
     <w:basedOn w:val="DefaultParagraphFont"/>
     <w:rsid w:val="000C4800"/>
   </w:style>
-  <w:style w:type="character" w:styleId="PlaceholderText">
-    <w:name w:val="Placeholder Text"/>
-    <w:basedOn w:val="DefaultParagraphFont"/>
-    <w:uiPriority w:val="99"/>
-    <w:semiHidden/>
-    <w:rsid w:val="00532349"/>
-    <w:rPr>
-      <w:color w:val="666666"/>
-    </w:rPr>
-  </w:style>
 </w:styles>
-</file>
-
-<file path=word/glossary/document.xml><?xml version="1.0" encoding="utf-8"?>
-<w:glossaryDocument xmlns:wpc="http://schemas.microsoft.com/office/word/2010/wordprocessingCanvas" xmlns:cx="http://schemas.microsoft.com/office/drawing/2014/chartex" xmlns:cx1="http://schemas.microsoft.com/office/drawing/2015/9/8/chartex" xmlns:cx2="http://schemas.microsoft.com/office/drawing/2015/10/21/chartex" xmlns:cx3="http://schemas.microsoft.com/office/drawing/2016/5/9/chartex" xmlns:cx4="http://schemas.microsoft.com/office/drawing/2016/5/10/chartex" xmlns:cx5="http://schemas.microsoft.com/office/drawing/2016/5/11/chartex" xmlns:cx6="http://schemas.microsoft.com/office/drawing/2016/5/12/chartex" xmlns:cx7="http://schemas.microsoft.com/office/drawing/2016/5/13/chartex" xmlns:cx8="http://schemas.microsoft.com/office/drawing/2016/5/14/chartex" xmlns:mc="http://schemas.openxmlformats.org/markup-compatibility/2006" xmlns:m="http://schemas.openxmlformats.org/officeDocument/2006/math" xmlns:aink="http://schemas.microsoft.com/office/drawing/2016/ink" xmlns:am3d="http://schemas.microsoft.com/office/drawing/2017/model3d" xmlns:oel="http://schemas.microsoft.com/office/2019/extlst" xmlns:r="http://schemas.openxmlformats.org/officeDocument/2006/relationships" xmlns:wp14="http://schemas.microsoft.com/office/word/2010/wordprocessingDrawing" xmlns:wp="http://schemas.openxmlformats.org/drawingml/2006/wordprocessingDrawing" xmlns:wpg="http://schemas.microsoft.com/office/word/2010/wordprocessingGroup" xmlns:wpi="http://schemas.microsoft.com/office/word/2010/wordprocessingInk" xmlns:wps="http://schemas.microsoft.com/office/word/2010/wordprocessingShape" xmlns:o="urn:schemas-microsoft-com:office:office" xmlns:v="urn:schemas-microsoft-com:vml" xmlns:w10="urn:schemas-microsoft-com:office:word" xmlns:w="http://schemas.openxmlformats.org/wordprocessingml/2006/main" xmlns:w14="http://schemas.microsoft.com/office/word/2010/wordml" xmlns:w15="http://schemas.microsoft.com/office/word/2012/wordml" xmlns:w16cex="http://schemas.microsoft.com/office/word/2018/wordml/cex" xmlns:w16cid="http://schemas.microsoft.com/office/word/2016/wordml/cid" xmlns:w16="http://schemas.microsoft.com/office/word/2018/wordml" xmlns:w16sdtdh="http://schemas.microsoft.com/office/word/2020/wordml/sdtdatahash" xmlns:w16sdtfl="http://schemas.microsoft.com/office/word/2024/wordml/sdtformatlock" xmlns:w16se="http://schemas.microsoft.com/office/word/2015/wordml/symex" xmlns:w16du="http://schemas.microsoft.com/office/word/2023/wordml/word16du" xmlns:wne="http://schemas.microsoft.com/office/word/2006/wordml" mc:Ignorable="w14 w15 w16se w16cid w16 w16cex w16sdtdh w16sdtfl w16du wp14">
-  <w:docParts>
-    <w:docPart>
-      <w:docPartPr>
-        <w:name w:val="DefaultPlaceholder_-1854013438"/>
-        <w:category>
-          <w:name w:val="General"/>
-          <w:gallery w:val="placeholder"/>
-        </w:category>
-        <w:types>
-          <w:type w:val="bbPlcHdr"/>
-        </w:types>
-        <w:behaviors>
-          <w:behavior w:val="content"/>
-        </w:behaviors>
-        <w:guid w:val="{0C5B4DD8-0229-6B49-AC8F-3CE381FD7A86}"/>
-      </w:docPartPr>
-      <w:docPartBody>
-        <w:p>
-          <w:r>
-            <w:rPr>
-              <w:rStyle w:val="PlaceholderText"/>
-            </w:rPr>
-            <w:t>Choose an item.</w:t>
-          </w:r>
-        </w:p>
-      </w:docPartBody>
-    </w:docPart>
-  </w:docParts>
-</w:glossaryDocument>
-</file>
-
-<file path=word/glossary/fontTable.xml><?xml version="1.0" encoding="utf-8"?>
-<w:fonts xmlns:mc="http://schemas.openxmlformats.org/markup-compatibility/2006" xmlns:r="http://schemas.openxmlformats.org/officeDocument/2006/relationships" xmlns:w="http://schemas.openxmlformats.org/wordprocessingml/2006/main" xmlns:w14="http://schemas.microsoft.com/office/word/2010/wordml" xmlns:w15="http://schemas.microsoft.com/office/word/2012/wordml" xmlns:w16cex="http://schemas.microsoft.com/office/word/2018/wordml/cex" xmlns:w16cid="http://schemas.microsoft.com/office/word/2016/wordml/cid" xmlns:w16="http://schemas.microsoft.com/office/word/2018/wordml" xmlns:w16sdtdh="http://schemas.microsoft.com/office/word/2020/wordml/sdtdatahash" xmlns:w16sdtfl="http://schemas.microsoft.com/office/word/2024/wordml/sdtformatlock" xmlns:w16se="http://schemas.microsoft.com/office/word/2015/wordml/symex" xmlns:w16du="http://schemas.microsoft.com/office/word/2023/wordml/word16du" mc:Ignorable="w14 w15 w16se w16cid w16 w16cex w16sdtdh w16sdtfl w16du">
-  <w:font w:name="Calibri">
-    <w:panose1 w:val="020F0502020204030204"/>
-    <w:charset w:val="00"/>
-    <w:family w:val="swiss"/>
-    <w:pitch w:val="variable"/>
-    <w:sig w:usb0="E0002AFF" w:usb1="C000247B" w:usb2="00000009" w:usb3="00000000" w:csb0="000001FF" w:csb1="00000000"/>
-  </w:font>
-  <w:font w:name="Times New Roman">
-    <w:panose1 w:val="02020603050405020304"/>
-    <w:charset w:val="00"/>
-    <w:family w:val="roman"/>
-    <w:pitch w:val="variable"/>
-    <w:sig w:usb0="E0002EFF" w:usb1="C000785B" w:usb2="00000009" w:usb3="00000000" w:csb0="000001FF" w:csb1="00000000"/>
-  </w:font>
-  <w:font w:name="Calibri Light">
-    <w:panose1 w:val="020F0302020204030204"/>
-    <w:charset w:val="EE"/>
-    <w:family w:val="swiss"/>
-    <w:pitch w:val="variable"/>
-    <w:sig w:usb0="E4002EFF" w:usb1="C000247B" w:usb2="00000009" w:usb3="00000000" w:csb0="000001FF" w:csb1="00000000"/>
-  </w:font>
-  <w:font w:name="MS Gothic">
-    <w:altName w:val="ＭＳ ゴシック"/>
-    <w:panose1 w:val="020B0609070205080204"/>
-    <w:charset w:val="80"/>
-    <w:family w:val="modern"/>
-    <w:pitch w:val="fixed"/>
-    <w:sig w:usb0="E00002FF" w:usb1="6AC7FDFB" w:usb2="08000012" w:usb3="00000000" w:csb0="0002009F" w:csb1="00000000"/>
-  </w:font>
-  <w:font w:name="Aptos">
-    <w:panose1 w:val="020B0004020202020204"/>
-    <w:charset w:val="00"/>
-    <w:family w:val="swiss"/>
-    <w:pitch w:val="variable"/>
-    <w:sig w:usb0="20000287" w:usb1="00000003" w:usb2="00000000" w:usb3="00000000" w:csb0="0000019F" w:csb1="00000000"/>
-  </w:font>
-  <w:font w:name="Aptos Display">
-    <w:panose1 w:val="020B0004020202020204"/>
-    <w:charset w:val="00"/>
-    <w:family w:val="swiss"/>
-    <w:pitch w:val="variable"/>
-    <w:sig w:usb0="20000287" w:usb1="00000003" w:usb2="00000000" w:usb3="00000000" w:csb0="0000019F" w:csb1="00000000"/>
-  </w:font>
-</w:fonts>
-</file>
-
-<file path=word/glossary/settings.xml><?xml version="1.0" encoding="utf-8"?>
-<w:settings xmlns:mc="http://schemas.openxmlformats.org/markup-compatibility/2006" xmlns:m="http://schemas.openxmlformats.org/officeDocument/2006/math" xmlns:r="http://schemas.openxmlformats.org/officeDocument/2006/relationships" xmlns:sl="http://schemas.openxmlformats.org/schemaLibrary/2006/main" xmlns:o="urn:schemas-microsoft-com:office:office" xmlns:v="urn:schemas-microsoft-com:vml" xmlns:w10="urn:schemas-microsoft-com:office:word" xmlns:w="http://schemas.openxmlformats.org/wordprocessingml/2006/main" xmlns:w14="http://schemas.microsoft.com/office/word/2010/wordml" xmlns:w15="http://schemas.microsoft.com/office/word/2012/wordml" xmlns:w16cex="http://schemas.microsoft.com/office/word/2018/wordml/cex" xmlns:w16cid="http://schemas.microsoft.com/office/word/2016/wordml/cid" xmlns:w16="http://schemas.microsoft.com/office/word/2018/wordml" xmlns:w16sdtdh="http://schemas.microsoft.com/office/word/2020/wordml/sdtdatahash" xmlns:w16sdtfl="http://schemas.microsoft.com/office/word/2024/wordml/sdtformatlock" xmlns:w16se="http://schemas.microsoft.com/office/word/2015/wordml/symex" xmlns:w16du="http://schemas.microsoft.com/office/word/2023/wordml/word16du" mc:Ignorable="w14 w15 w16se w16cid w16 w16cex w16sdtdh w16sdtfl w16du">
-  <w:view w:val="normal"/>
-  <w:defaultTabStop w:val="720"/>
-  <w:characterSpacingControl w:val="doNotCompress"/>
-  <w:compat>
-    <w:useFELayout/>
-    <w:compatSetting w:name="compatibilityMode" w:uri="http://schemas.microsoft.com/office/word" w:val="15"/>
-    <w:compatSetting w:name="overrideTableStyleFontSizeAndJustification" w:uri="http://schemas.microsoft.com/office/word" w:val="1"/>
-    <w:compatSetting w:name="enableOpenTypeFeatures" w:uri="http://schemas.microsoft.com/office/word" w:val="1"/>
-    <w:compatSetting w:name="doNotFlipMirrorIndents" w:uri="http://schemas.microsoft.com/office/word" w:val="1"/>
-    <w:compatSetting w:name="differentiateMultirowTableHeaders" w:uri="http://schemas.microsoft.com/office/word" w:val="1"/>
-    <w:compatSetting w:name="useWord2013TrackBottomHyphenation" w:uri="http://schemas.microsoft.com/office/word" w:val="0"/>
-  </w:compat>
-  <w:rsids>
-    <w:rsidRoot w:val="00291FBF"/>
-    <w:rsid w:val="00291FBF"/>
-    <w:rsid w:val="00665C0A"/>
-    <w:rsid w:val="00955F7A"/>
-    <w:rsid w:val="00A74329"/>
-    <w:rsid w:val="00AE7811"/>
-    <w:rsid w:val="00D446F0"/>
-  </w:rsids>
-  <m:mathPr>
-    <m:mathFont m:val="Cambria Math"/>
-    <m:brkBin m:val="before"/>
-    <m:brkBinSub m:val="--"/>
-    <m:smallFrac m:val="0"/>
-    <m:dispDef/>
-    <m:lMargin m:val="0"/>
-    <m:rMargin m:val="0"/>
-    <m:defJc m:val="centerGroup"/>
-    <m:wrapIndent m:val="1440"/>
-    <m:intLim m:val="subSup"/>
-    <m:naryLim m:val="undOvr"/>
-  </m:mathPr>
-  <w:themeFontLang w:val="en-US"/>
-  <w:clrSchemeMapping w:bg1="light1" w:t1="dark1" w:bg2="light2" w:t2="dark2" w:accent1="accent1" w:accent2="accent2" w:accent3="accent3" w:accent4="accent4" w:accent5="accent5" w:accent6="accent6" w:hyperlink="hyperlink" w:followedHyperlink="followedHyperlink"/>
-  <w:decimalSymbol w:val="."/>
-  <w:listSeparator w:val=","/>
-  <w15:chartTrackingRefBased/>
-</w:settings>
-</file>
-
-<file path=word/glossary/styles.xml><?xml version="1.0" encoding="utf-8"?>
-<w:styles xmlns:mc="http://schemas.openxmlformats.org/markup-compatibility/2006" xmlns:r="http://schemas.openxmlformats.org/officeDocument/2006/relationships" xmlns:w="http://schemas.openxmlformats.org/wordprocessingml/2006/main" xmlns:w14="http://schemas.microsoft.com/office/word/2010/wordml" xmlns:w15="http://schemas.microsoft.com/office/word/2012/wordml" xmlns:w16cex="http://schemas.microsoft.com/office/word/2018/wordml/cex" xmlns:w16cid="http://schemas.microsoft.com/office/word/2016/wordml/cid" xmlns:w16="http://schemas.microsoft.com/office/word/2018/wordml" xmlns:w16sdtdh="http://schemas.microsoft.com/office/word/2020/wordml/sdtdatahash" xmlns:w16sdtfl="http://schemas.microsoft.com/office/word/2024/wordml/sdtformatlock" xmlns:w16se="http://schemas.microsoft.com/office/word/2015/wordml/symex" xmlns:w16du="http://schemas.microsoft.com/office/word/2023/wordml/word16du" mc:Ignorable="w14 w15 w16se w16cid w16 w16cex w16sdtdh w16sdtfl w16du">
-  <w:docDefaults>
-    <w:rPrDefault>
-      <w:rPr>
-        <w:rFonts w:asciiTheme="minorHAnsi" w:eastAsiaTheme="minorEastAsia" w:hAnsiTheme="minorHAnsi" w:cstheme="minorBidi"/>
-        <w:kern w:val="2"/>
-        <w:sz w:val="24"/>
-        <w:szCs w:val="24"/>
-        <w:lang w:val="en-US" w:eastAsia="en-US" w:bidi="ar-SA"/>
-        <w14:ligatures w14:val="standardContextual"/>
-      </w:rPr>
-    </w:rPrDefault>
-    <w:pPrDefault>
-      <w:pPr>
-        <w:spacing w:after="160" w:line="278" w:lineRule="auto"/>
-      </w:pPr>
-    </w:pPrDefault>
-  </w:docDefaults>
-  <w:latentStyles w:defLockedState="0" w:defUIPriority="99" w:defSemiHidden="0" w:defUnhideWhenUsed="0" w:defQFormat="0" w:count="376">
-    <w:lsdException w:name="Normal" w:uiPriority="0" w:qFormat="1"/>
-    <w:lsdException w:name="heading 1" w:uiPriority="9" w:qFormat="1"/>
-    <w:lsdException w:name="heading 2" w:semiHidden="1" w:uiPriority="9" w:unhideWhenUsed="1" w:qFormat="1"/>
-    <w:lsdException w:name="heading 3" w:semiHidden="1" w:uiPriority="9" w:unhideWhenUsed="1" w:qFormat="1"/>
-    <w:lsdException w:name="heading 4" w:semiHidden="1" w:uiPriority="9" w:unhideWhenUsed="1" w:qFormat="1"/>
-    <w:lsdException w:name="heading 5" w:semiHidden="1" w:uiPriority="9" w:unhideWhenUsed="1" w:qFormat="1"/>
-    <w:lsdException w:name="heading 6" w:semiHidden="1" w:uiPriority="9" w:unhideWhenUsed="1" w:qFormat="1"/>
-    <w:lsdException w:name="heading 7" w:semiHidden="1" w:uiPriority="9" w:unhideWhenUsed="1" w:qFormat="1"/>
-    <w:lsdException w:name="heading 8" w:semiHidden="1" w:uiPriority="9" w:unhideWhenUsed="1" w:qFormat="1"/>
-    <w:lsdException w:name="heading 9" w:semiHidden="1" w:uiPriority="9" w:unhideWhenUsed="1" w:qFormat="1"/>
-    <w:lsdException w:name="index 1" w:semiHidden="1" w:unhideWhenUsed="1"/>
-    <w:lsdException w:name="index 2" w:semiHidden="1" w:unhideWhenUsed="1"/>
-    <w:lsdException w:name="index 3" w:semiHidden="1" w:unhideWhenUsed="1"/>
-    <w:lsdException w:name="index 4" w:semiHidden="1" w:unhideWhenUsed="1"/>
-    <w:lsdException w:name="index 5" w:semiHidden="1" w:unhideWhenUsed="1"/>
-    <w:lsdException w:name="index 6" w:semiHidden="1" w:unhideWhenUsed="1"/>
-    <w:lsdException w:name="index 7" w:semiHidden="1" w:unhideWhenUsed="1"/>
-    <w:lsdException w:name="index 8" w:semiHidden="1" w:unhideWhenUsed="1"/>
-    <w:lsdException w:name="index 9" w:semiHidden="1" w:unhideWhenUsed="1"/>
-    <w:lsdException w:name="toc 1" w:semiHidden="1" w:uiPriority="39" w:unhideWhenUsed="1"/>
-    <w:lsdException w:name="toc 2" w:semiHidden="1" w:uiPriority="39" w:unhideWhenUsed="1"/>
-    <w:lsdException w:name="toc 3" w:semiHidden="1" w:uiPriority="39" w:unhideWhenUsed="1"/>
-    <w:lsdException w:name="toc 4" w:semiHidden="1" w:uiPriority="39" w:unhideWhenUsed="1"/>
-    <w:lsdException w:name="toc 5" w:semiHidden="1" w:uiPriority="39" w:unhideWhenUsed="1"/>
-    <w:lsdException w:name="toc 6" w:semiHidden="1" w:uiPriority="39" w:unhideWhenUsed="1"/>
-    <w:lsdException w:name="toc 7" w:semiHidden="1" w:uiPriority="39" w:unhideWhenUsed="1"/>
-    <w:lsdException w:name="toc 8" w:semiHidden="1" w:uiPriority="39" w:unhideWhenUsed="1"/>
-    <w:lsdException w:name="toc 9" w:semiHidden="1" w:uiPriority="39" w:unhideWhenUsed="1"/>
-    <w:lsdException w:name="Normal Indent" w:semiHidden="1" w:unhideWhenUsed="1"/>
-    <w:lsdException w:name="footnote text" w:semiHidden="1" w:unhideWhenUsed="1"/>
-    <w:lsdException w:name="annotation text" w:semiHidden="1" w:unhideWhenUsed="1"/>
-    <w:lsdException w:name="header" w:semiHidden="1" w:unhideWhenUsed="1"/>
-    <w:lsdException w:name="footer" w:semiHidden="1" w:unhideWhenUsed="1"/>
-    <w:lsdException w:name="index heading" w:semiHidden="1" w:unhideWhenUsed="1"/>
-    <w:lsdException w:name="caption" w:semiHidden="1" w:uiPriority="35" w:unhideWhenUsed="1" w:qFormat="1"/>
-    <w:lsdException w:name="table of figures" w:semiHidden="1" w:unhideWhenUsed="1"/>
-    <w:lsdException w:name="envelope address" w:semiHidden="1" w:unhideWhenUsed="1"/>
-    <w:lsdException w:name="envelope return" w:semiHidden="1" w:unhideWhenUsed="1"/>
-    <w:lsdException w:name="footnote reference" w:semiHidden="1" w:unhideWhenUsed="1"/>
-    <w:lsdException w:name="annotation reference" w:semiHidden="1" w:unhideWhenUsed="1"/>
-    <w:lsdException w:name="line number" w:semiHidden="1" w:unhideWhenUsed="1"/>
-    <w:lsdException w:name="page number" w:semiHidden="1" w:unhideWhenUsed="1"/>
-    <w:lsdException w:name="endnote reference" w:semiHidden="1" w:unhideWhenUsed="1"/>
-    <w:lsdException w:name="endnote text" w:semiHidden="1" w:unhideWhenUsed="1"/>
-    <w:lsdException w:name="table of authorities" w:semiHidden="1" w:unhideWhenUsed="1"/>
-    <w:lsdException w:name="macro" w:semiHidden="1" w:unhideWhenUsed="1"/>
-    <w:lsdException w:name="toa heading" w:semiHidden="1" w:unhideWhenUsed="1"/>
-    <w:lsdException w:name="List" w:semiHidden="1" w:unhideWhenUsed="1"/>
-    <w:lsdException w:name="List Bullet" w:semiHidden="1" w:unhideWhenUsed="1"/>
-    <w:lsdException w:name="List Number" w:semiHidden="1" w:unhideWhenUsed="1"/>
-    <w:lsdException w:name="List 2" w:semiHidden="1" w:unhideWhenUsed="1"/>
-    <w:lsdException w:name="List 3" w:semiHidden="1" w:unhideWhenUsed="1"/>
-    <w:lsdException w:name="List 4" w:semiHidden="1" w:unhideWhenUsed="1"/>
-    <w:lsdException w:name="List 5" w:semiHidden="1" w:unhideWhenUsed="1"/>
-    <w:lsdException w:name="List Bullet 2" w:semiHidden="1" w:unhideWhenUsed="1"/>
-    <w:lsdException w:name="List Bullet 3" w:semiHidden="1" w:unhideWhenUsed="1"/>
-    <w:lsdException w:name="List Bullet 4" w:semiHidden="1" w:unhideWhenUsed="1"/>
-    <w:lsdException w:name="List Bullet 5" w:semiHidden="1" w:unhideWhenUsed="1"/>
-    <w:lsdException w:name="List Number 2" w:semiHidden="1" w:unhideWhenUsed="1"/>
-    <w:lsdException w:name="List Number 3" w:semiHidden="1" w:unhideWhenUsed="1"/>
-    <w:lsdException w:name="List Number 4" w:semiHidden="1" w:unhideWhenUsed="1"/>
-    <w:lsdException w:name="List Number 5" w:semiHidden="1" w:unhideWhenUsed="1"/>
-    <w:lsdException w:name="Title" w:uiPriority="10" w:qFormat="1"/>
-    <w:lsdException w:name="Closing" w:semiHidden="1" w:unhideWhenUsed="1"/>
-    <w:lsdException w:name="Signature" w:semiHidden="1" w:unhideWhenUsed="1"/>
-    <w:lsdException w:name="Default Paragraph Font" w:semiHidden="1" w:uiPriority="1" w:unhideWhenUsed="1"/>
-    <w:lsdException w:name="Body Text" w:semiHidden="1" w:unhideWhenUsed="1"/>
-    <w:lsdException w:name="Body Text Indent" w:semiHidden="1" w:unhideWhenUsed="1"/>
-    <w:lsdException w:name="List Continue" w:semiHidden="1" w:unhideWhenUsed="1"/>
-    <w:lsdException w:name="List Continue 2" w:semiHidden="1" w:unhideWhenUsed="1"/>
-    <w:lsdException w:name="List Continue 3" w:semiHidden="1" w:unhideWhenUsed="1"/>
-    <w:lsdException w:name="List Continue 4" w:semiHidden="1" w:unhideWhenUsed="1"/>
-    <w:lsdException w:name="List Continue 5" w:semiHidden="1" w:unhideWhenUsed="1"/>
-    <w:lsdException w:name="Message Header" w:semiHidden="1" w:unhideWhenUsed="1"/>
-    <w:lsdException w:name="Subtitle" w:uiPriority="11" w:qFormat="1"/>
-    <w:lsdException w:name="Salutation" w:semiHidden="1" w:unhideWhenUsed="1"/>
-    <w:lsdException w:name="Date" w:semiHidden="1" w:unhideWhenUsed="1"/>
-    <w:lsdException w:name="Body Text First Indent" w:semiHidden="1" w:unhideWhenUsed="1"/>
-    <w:lsdException w:name="Body Text First Indent 2" w:semiHidden="1" w:unhideWhenUsed="1"/>
-    <w:lsdException w:name="Note Heading" w:semiHidden="1" w:unhideWhenUsed="1"/>
-    <w:lsdException w:name="Body Text 2" w:semiHidden="1" w:unhideWhenUsed="1"/>
-    <w:lsdException w:name="Body Text 3" w:semiHidden="1" w:unhideWhenUsed="1"/>
-    <w:lsdException w:name="Body Text Indent 2" w:semiHidden="1" w:unhideWhenUsed="1"/>
-    <w:lsdException w:name="Body Text Indent 3" w:semiHidden="1" w:unhideWhenUsed="1"/>
-    <w:lsdException w:name="Block Text" w:semiHidden="1" w:unhideWhenUsed="1"/>
-    <w:lsdException w:name="Hyperlink" w:semiHidden="1" w:unhideWhenUsed="1"/>
-    <w:lsdException w:name="FollowedHyperlink" w:semiHidden="1" w:unhideWhenUsed="1"/>
-    <w:lsdException w:name="Strong" w:uiPriority="22" w:qFormat="1"/>
-    <w:lsdException w:name="Emphasis" w:uiPriority="20" w:qFormat="1"/>
-    <w:lsdException w:name="Document Map" w:semiHidden="1" w:unhideWhenUsed="1"/>
-    <w:lsdException w:name="Plain Text" w:semiHidden="1" w:unhideWhenUsed="1"/>
-    <w:lsdException w:name="E-mail Signature" w:semiHidden="1" w:unhideWhenUsed="1"/>
-    <w:lsdException w:name="HTML Top of Form" w:semiHidden="1" w:unhideWhenUsed="1"/>
-    <w:lsdException w:name="HTML Bottom of Form" w:semiHidden="1" w:unhideWhenUsed="1"/>
-    <w:lsdException w:name="Normal (Web)" w:semiHidden="1" w:unhideWhenUsed="1"/>
-    <w:lsdException w:name="HTML Acronym" w:semiHidden="1" w:unhideWhenUsed="1"/>
-    <w:lsdException w:name="HTML Address" w:semiHidden="1" w:unhideWhenUsed="1"/>
-    <w:lsdException w:name="HTML Cite" w:semiHidden="1" w:unhideWhenUsed="1"/>
-    <w:lsdException w:name="HTML Code" w:semiHidden="1" w:unhideWhenUsed="1"/>
-    <w:lsdException w:name="HTML Definition" w:semiHidden="1" w:unhideWhenUsed="1"/>
-    <w:lsdException w:name="HTML Keyboard" w:semiHidden="1" w:unhideWhenUsed="1"/>
-    <w:lsdException w:name="HTML Preformatted" w:semiHidden="1" w:unhideWhenUsed="1"/>
-    <w:lsdException w:name="HTML Sample" w:semiHidden="1" w:unhideWhenUsed="1"/>
-    <w:lsdException w:name="HTML Typewriter" w:semiHidden="1" w:unhideWhenUsed="1"/>
-    <w:lsdException w:name="HTML Variable" w:semiHidden="1" w:unhideWhenUsed="1"/>
-    <w:lsdException w:name="Normal Table" w:semiHidden="1" w:unhideWhenUsed="1"/>
-    <w:lsdException w:name="annotation subject" w:semiHidden="1" w:unhideWhenUsed="1"/>
-    <w:lsdException w:name="No List" w:semiHidden="1" w:unhideWhenUsed="1"/>
-    <w:lsdException w:name="Outline List 1" w:semiHidden="1" w:unhideWhenUsed="1"/>
-    <w:lsdException w:name="Outline List 2" w:semiHidden="1" w:unhideWhenUsed="1"/>
-    <w:lsdException w:name="Outline List 3" w:semiHidden="1" w:unhideWhenUsed="1"/>
-    <w:lsdException w:name="Table Simple 1" w:semiHidden="1" w:unhideWhenUsed="1"/>
-    <w:lsdException w:name="Table Simple 2" w:semiHidden="1" w:unhideWhenUsed="1"/>
-    <w:lsdException w:name="Table Simple 3" w:semiHidden="1" w:unhideWhenUsed="1"/>
-    <w:lsdException w:name="Table Classic 1" w:semiHidden="1" w:unhideWhenUsed="1"/>
-    <w:lsdException w:name="Table Classic 2" w:semiHidden="1" w:unhideWhenUsed="1"/>
-    <w:lsdException w:name="Table Classic 3" w:semiHidden="1" w:unhideWhenUsed="1"/>
-    <w:lsdException w:name="Table Classic 4" w:semiHidden="1" w:unhideWhenUsed="1"/>
-    <w:lsdException w:name="Table Colorful 1" w:semiHidden="1" w:unhideWhenUsed="1"/>
-    <w:lsdException w:name="Table Colorful 2" w:semiHidden="1" w:unhideWhenUsed="1"/>
-    <w:lsdException w:name="Table Colorful 3" w:semiHidden="1" w:unhideWhenUsed="1"/>
-    <w:lsdException w:name="Table Columns 1" w:semiHidden="1" w:unhideWhenUsed="1"/>
-    <w:lsdException w:name="Table Columns 2" w:semiHidden="1" w:unhideWhenUsed="1"/>
-    <w:lsdException w:name="Table Columns 3" w:semiHidden="1" w:unhideWhenUsed="1"/>
-    <w:lsdException w:name="Table Columns 4" w:semiHidden="1" w:unhideWhenUsed="1"/>
-    <w:lsdException w:name="Table Columns 5" w:semiHidden="1" w:unhideWhenUsed="1"/>
-    <w:lsdException w:name="Table Grid 1" w:semiHidden="1" w:unhideWhenUsed="1"/>
-    <w:lsdException w:name="Table Grid 2" w:semiHidden="1" w:unhideWhenUsed="1"/>
-    <w:lsdException w:name="Table Grid 3" w:semiHidden="1" w:unhideWhenUsed="1"/>
-    <w:lsdException w:name="Table Grid 4" w:semiHidden="1" w:unhideWhenUsed="1"/>
-    <w:lsdException w:name="Table Grid 5" w:semiHidden="1" w:unhideWhenUsed="1"/>
-    <w:lsdException w:name="Table Grid 6" w:semiHidden="1" w:unhideWhenUsed="1"/>
-    <w:lsdException w:name="Table Grid 7" w:semiHidden="1" w:unhideWhenUsed="1"/>
-    <w:lsdException w:name="Table Grid 8" w:semiHidden="1" w:unhideWhenUsed="1"/>
-    <w:lsdException w:name="Table List 1" w:semiHidden="1" w:unhideWhenUsed="1"/>
-    <w:lsdException w:name="Table List 2" w:semiHidden="1" w:unhideWhenUsed="1"/>
-    <w:lsdException w:name="Table List 3" w:semiHidden="1" w:unhideWhenUsed="1"/>
-    <w:lsdException w:name="Table List 4" w:semiHidden="1" w:unhideWhenUsed="1"/>
-    <w:lsdException w:name="Table List 5" w:semiHidden="1" w:unhideWhenUsed="1"/>
-    <w:lsdException w:name="Table List 6" w:semiHidden="1" w:unhideWhenUsed="1"/>
-    <w:lsdException w:name="Table List 7" w:semiHidden="1" w:unhideWhenUsed="1"/>
-    <w:lsdException w:name="Table List 8" w:semiHidden="1" w:unhideWhenUsed="1"/>
-    <w:lsdException w:name="Table 3D effects 1" w:semiHidden="1" w:unhideWhenUsed="1"/>
-    <w:lsdException w:name="Table 3D effects 2" w:semiHidden="1" w:unhideWhenUsed="1"/>
-    <w:lsdException w:name="Table 3D effects 3" w:semiHidden="1" w:unhideWhenUsed="1"/>
-    <w:lsdException w:name="Table Contemporary" w:semiHidden="1" w:unhideWhenUsed="1"/>
-    <w:lsdException w:name="Table Elegant" w:semiHidden="1" w:unhideWhenUsed="1"/>
-    <w:lsdException w:name="Table Professional" w:semiHidden="1" w:unhideWhenUsed="1"/>
-    <w:lsdException w:name="Table Subtle 1" w:semiHidden="1" w:unhideWhenUsed="1"/>
-    <w:lsdException w:name="Table Subtle 2" w:semiHidden="1" w:unhideWhenUsed="1"/>
-    <w:lsdException w:name="Table Web 1" w:semiHidden="1" w:unhideWhenUsed="1"/>
-    <w:lsdException w:name="Table Web 2" w:semiHidden="1" w:unhideWhenUsed="1"/>
-    <w:lsdException w:name="Table Web 3" w:semiHidden="1" w:unhideWhenUsed="1"/>
-    <w:lsdException w:name="Balloon Text" w:semiHidden="1" w:unhideWhenUsed="1"/>
-    <w:lsdException w:name="Table Grid" w:uiPriority="39"/>
-    <w:lsdException w:name="Table Theme" w:semiHidden="1" w:unhideWhenUsed="1"/>
-    <w:lsdException w:name="Placeholder Text" w:semiHidden="1"/>
-    <w:lsdException w:name="No Spacing" w:uiPriority="1" w:qFormat="1"/>
-    <w:lsdException w:name="Light Shading" w:uiPriority="60"/>
-    <w:lsdException w:name="Light List" w:uiPriority="61"/>
-    <w:lsdException w:name="Light Grid" w:uiPriority="62"/>
-    <w:lsdException w:name="Medium Shading 1" w:uiPriority="63"/>
-    <w:lsdException w:name="Medium Shading 2" w:uiPriority="64"/>
-    <w:lsdException w:name="Medium List 1" w:uiPriority="65"/>
-    <w:lsdException w:name="Medium List 2" w:uiPriority="66"/>
-    <w:lsdException w:name="Medium Grid 1" w:uiPriority="67"/>
-    <w:lsdException w:name="Medium Grid 2" w:uiPriority="68"/>
-    <w:lsdException w:name="Medium Grid 3" w:uiPriority="69"/>
-    <w:lsdException w:name="Dark List" w:uiPriority="70"/>
-    <w:lsdException w:name="Colorful Shading" w:uiPriority="71"/>
-    <w:lsdException w:name="Colorful List" w:uiPriority="72"/>
-    <w:lsdException w:name="Colorful Grid" w:uiPriority="73"/>
-    <w:lsdException w:name="Light Shading Accent 1" w:uiPriority="60"/>
-    <w:lsdException w:name="Light List Accent 1" w:uiPriority="61"/>
-    <w:lsdException w:name="Light Grid Accent 1" w:uiPriority="62"/>
-    <w:lsdException w:name="Medium Shading 1 Accent 1" w:uiPriority="63"/>
-    <w:lsdException w:name="Medium Shading 2 Accent 1" w:uiPriority="64"/>
-    <w:lsdException w:name="Medium List 1 Accent 1" w:uiPriority="65"/>
-    <w:lsdException w:name="Revision" w:semiHidden="1"/>
-    <w:lsdException w:name="List Paragraph" w:uiPriority="34" w:qFormat="1"/>
-    <w:lsdException w:name="Quote" w:uiPriority="29" w:qFormat="1"/>
-    <w:lsdException w:name="Intense Quote" w:uiPriority="30" w:qFormat="1"/>
-    <w:lsdException w:name="Medium List 2 Accent 1" w:uiPriority="66"/>
-    <w:lsdException w:name="Medium Grid 1 Accent 1" w:uiPriority="67"/>
-    <w:lsdException w:name="Medium Grid 2 Accent 1" w:uiPriority="68"/>
-    <w:lsdException w:name="Medium Grid 3 Accent 1" w:uiPriority="69"/>
-    <w:lsdException w:name="Dark List Accent 1" w:uiPriority="70"/>
-    <w:lsdException w:name="Colorful Shading Accent 1" w:uiPriority="71"/>
-    <w:lsdException w:name="Colorful List Accent 1" w:uiPriority="72"/>
-    <w:lsdException w:name="Colorful Grid Accent 1" w:uiPriority="73"/>
-    <w:lsdException w:name="Light Shading Accent 2" w:uiPriority="60"/>
-    <w:lsdException w:name="Light List Accent 2" w:uiPriority="61"/>
-    <w:lsdException w:name="Light Grid Accent 2" w:uiPriority="62"/>
-    <w:lsdException w:name="Medium Shading 1 Accent 2" w:uiPriority="63"/>
-    <w:lsdException w:name="Medium Shading 2 Accent 2" w:uiPriority="64"/>
-    <w:lsdException w:name="Medium List 1 Accent 2" w:uiPriority="65"/>
-    <w:lsdException w:name="Medium List 2 Accent 2" w:uiPriority="66"/>
-    <w:lsdException w:name="Medium Grid 1 Accent 2" w:uiPriority="67"/>
-    <w:lsdException w:name="Medium Grid 2 Accent 2" w:uiPriority="68"/>
-    <w:lsdException w:name="Medium Grid 3 Accent 2" w:uiPriority="69"/>
-    <w:lsdException w:name="Dark List Accent 2" w:uiPriority="70"/>
-    <w:lsdException w:name="Colorful Shading Accent 2" w:uiPriority="71"/>
-    <w:lsdException w:name="Colorful List Accent 2" w:uiPriority="72"/>
-    <w:lsdException w:name="Colorful Grid Accent 2" w:uiPriority="73"/>
-    <w:lsdException w:name="Light Shading Accent 3" w:uiPriority="60"/>
-    <w:lsdException w:name="Light List Accent 3" w:uiPriority="61"/>
-    <w:lsdException w:name="Light Grid Accent 3" w:uiPriority="62"/>
-    <w:lsdException w:name="Medium Shading 1 Accent 3" w:uiPriority="63"/>
-    <w:lsdException w:name="Medium Shading 2 Accent 3" w:uiPriority="64"/>
-    <w:lsdException w:name="Medium List 1 Accent 3" w:uiPriority="65"/>
-    <w:lsdException w:name="Medium List 2 Accent 3" w:uiPriority="66"/>
-    <w:lsdException w:name="Medium Grid 1 Accent 3" w:uiPriority="67"/>
-    <w:lsdException w:name="Medium Grid 2 Accent 3" w:uiPriority="68"/>
-    <w:lsdException w:name="Medium Grid 3 Accent 3" w:uiPriority="69"/>
-    <w:lsdException w:name="Dark List Accent 3" w:uiPriority="70"/>
-    <w:lsdException w:name="Colorful Shading Accent 3" w:uiPriority="71"/>
-    <w:lsdException w:name="Colorful List Accent 3" w:uiPriority="72"/>
-    <w:lsdException w:name="Colorful Grid Accent 3" w:uiPriority="73"/>
-    <w:lsdException w:name="Light Shading Accent 4" w:uiPriority="60"/>
-    <w:lsdException w:name="Light List Accent 4" w:uiPriority="61"/>
-    <w:lsdException w:name="Light Grid Accent 4" w:uiPriority="62"/>
-    <w:lsdException w:name="Medium Shading 1 Accent 4" w:uiPriority="63"/>
-    <w:lsdException w:name="Medium Shading 2 Accent 4" w:uiPriority="64"/>
-    <w:lsdException w:name="Medium List 1 Accent 4" w:uiPriority="65"/>
-    <w:lsdException w:name="Medium List 2 Accent 4" w:uiPriority="66"/>
-    <w:lsdException w:name="Medium Grid 1 Accent 4" w:uiPriority="67"/>
-    <w:lsdException w:name="Medium Grid 2 Accent 4" w:uiPriority="68"/>
-    <w:lsdException w:name="Medium Grid 3 Accent 4" w:uiPriority="69"/>
-    <w:lsdException w:name="Dark List Accent 4" w:uiPriority="70"/>
-    <w:lsdException w:name="Colorful Shading Accent 4" w:uiPriority="71"/>
-    <w:lsdException w:name="Colorful List Accent 4" w:uiPriority="72"/>
-    <w:lsdException w:name="Colorful Grid Accent 4" w:uiPriority="73"/>
-    <w:lsdException w:name="Light Shading Accent 5" w:uiPriority="60"/>
-    <w:lsdException w:name="Light List Accent 5" w:uiPriority="61"/>
-    <w:lsdException w:name="Light Grid Accent 5" w:uiPriority="62"/>
-    <w:lsdException w:name="Medium Shading 1 Accent 5" w:uiPriority="63"/>
-    <w:lsdException w:name="Medium Shading 2 Accent 5" w:uiPriority="64"/>
-    <w:lsdException w:name="Medium List 1 Accent 5" w:uiPriority="65"/>
-    <w:lsdException w:name="Medium List 2 Accent 5" w:uiPriority="66"/>
-    <w:lsdException w:name="Medium Grid 1 Accent 5" w:uiPriority="67"/>
-    <w:lsdException w:name="Medium Grid 2 Accent 5" w:uiPriority="68"/>
-    <w:lsdException w:name="Medium Grid 3 Accent 5" w:uiPriority="69"/>
-    <w:lsdException w:name="Dark List Accent 5" w:uiPriority="70"/>
-    <w:lsdException w:name="Colorful Shading Accent 5" w:uiPriority="71"/>
-    <w:lsdException w:name="Colorful List Accent 5" w:uiPriority="72"/>
-    <w:lsdException w:name="Colorful Grid Accent 5" w:uiPriority="73"/>
-    <w:lsdException w:name="Light Shading Accent 6" w:uiPriority="60"/>
-    <w:lsdException w:name="Light List Accent 6" w:uiPriority="61"/>
-    <w:lsdException w:name="Light Grid Accent 6" w:uiPriority="62"/>
-    <w:lsdException w:name="Medium Shading 1 Accent 6" w:uiPriority="63"/>
-    <w:lsdException w:name="Medium Shading 2 Accent 6" w:uiPriority="64"/>
-    <w:lsdException w:name="Medium List 1 Accent 6" w:uiPriority="65"/>
-    <w:lsdException w:name="Medium List 2 Accent 6" w:uiPriority="66"/>
-    <w:lsdException w:name="Medium Grid 1 Accent 6" w:uiPriority="67"/>
-    <w:lsdException w:name="Medium Grid 2 Accent 6" w:uiPriority="68"/>
-    <w:lsdException w:name="Medium Grid 3 Accent 6" w:uiPriority="69"/>
-    <w:lsdException w:name="Dark List Accent 6" w:uiPriority="70"/>
-    <w:lsdException w:name="Colorful Shading Accent 6" w:uiPriority="71"/>
-    <w:lsdException w:name="Colorful List Accent 6" w:uiPriority="72"/>
-    <w:lsdException w:name="Colorful Grid Accent 6" w:uiPriority="73"/>
-    <w:lsdException w:name="Subtle Emphasis" w:uiPriority="19" w:qFormat="1"/>
-    <w:lsdException w:name="Intense Emphasis" w:uiPriority="21" w:qFormat="1"/>
-    <w:lsdException w:name="Subtle Reference" w:uiPriority="31" w:qFormat="1"/>
-    <w:lsdException w:name="Intense Reference" w:uiPriority="32" w:qFormat="1"/>
-    <w:lsdException w:name="Book Title" w:uiPriority="33" w:qFormat="1"/>
-    <w:lsdException w:name="Bibliography" w:semiHidden="1" w:uiPriority="37" w:unhideWhenUsed="1"/>
-    <w:lsdException w:name="TOC Heading" w:semiHidden="1" w:uiPriority="39" w:unhideWhenUsed="1" w:qFormat="1"/>
-    <w:lsdException w:name="Plain Table 1" w:uiPriority="41"/>
-    <w:lsdException w:name="Plain Table 2" w:uiPriority="42"/>
-    <w:lsdException w:name="Plain Table 3" w:uiPriority="43"/>
-    <w:lsdException w:name="Plain Table 4" w:uiPriority="44"/>
-    <w:lsdException w:name="Plain Table 5" w:uiPriority="45"/>
-    <w:lsdException w:name="Grid Table Light" w:uiPriority="40"/>
-    <w:lsdException w:name="Grid Table 1 Light" w:uiPriority="46"/>
-    <w:lsdException w:name="Grid Table 2" w:uiPriority="47"/>
-    <w:lsdException w:name="Grid Table 3" w:uiPriority="48"/>
-    <w:lsdException w:name="Grid Table 4" w:uiPriority="49"/>
-    <w:lsdException w:name="Grid Table 5 Dark" w:uiPriority="50"/>
-    <w:lsdException w:name="Grid Table 6 Colorful" w:uiPriority="51"/>
-    <w:lsdException w:name="Grid Table 7 Colorful" w:uiPriority="52"/>
-    <w:lsdException w:name="Grid Table 1 Light Accent 1" w:uiPriority="46"/>
-    <w:lsdException w:name="Grid Table 2 Accent 1" w:uiPriority="47"/>
-    <w:lsdException w:name="Grid Table 3 Accent 1" w:uiPriority="48"/>
-    <w:lsdException w:name="Grid Table 4 Accent 1" w:uiPriority="49"/>
-    <w:lsdException w:name="Grid Table 5 Dark Accent 1" w:uiPriority="50"/>
-    <w:lsdException w:name="Grid Table 6 Colorful Accent 1" w:uiPriority="51"/>
-    <w:lsdException w:name="Grid Table 7 Colorful Accent 1" w:uiPriority="52"/>
-    <w:lsdException w:name="Grid Table 1 Light Accent 2" w:uiPriority="46"/>
-    <w:lsdException w:name="Grid Table 2 Accent 2" w:uiPriority="47"/>
-    <w:lsdException w:name="Grid Table 3 Accent 2" w:uiPriority="48"/>
-    <w:lsdException w:name="Grid Table 4 Accent 2" w:uiPriority="49"/>
-    <w:lsdException w:name="Grid Table 5 Dark Accent 2" w:uiPriority="50"/>
-    <w:lsdException w:name="Grid Table 6 Colorful Accent 2" w:uiPriority="51"/>
-    <w:lsdException w:name="Grid Table 7 Colorful Accent 2" w:uiPriority="52"/>
-    <w:lsdException w:name="Grid Table 1 Light Accent 3" w:uiPriority="46"/>
-    <w:lsdException w:name="Grid Table 2 Accent 3" w:uiPriority="47"/>
-    <w:lsdException w:name="Grid Table 3 Accent 3" w:uiPriority="48"/>
-    <w:lsdException w:name="Grid Table 4 Accent 3" w:uiPriority="49"/>
-    <w:lsdException w:name="Grid Table 5 Dark Accent 3" w:uiPriority="50"/>
-    <w:lsdException w:name="Grid Table 6 Colorful Accent 3" w:uiPriority="51"/>
-    <w:lsdException w:name="Grid Table 7 Colorful Accent 3" w:uiPriority="52"/>
-    <w:lsdException w:name="Grid Table 1 Light Accent 4" w:uiPriority="46"/>
-    <w:lsdException w:name="Grid Table 2 Accent 4" w:uiPriority="47"/>
-    <w:lsdException w:name="Grid Table 3 Accent 4" w:uiPriority="48"/>
-    <w:lsdException w:name="Grid Table 4 Accent 4" w:uiPriority="49"/>
-    <w:lsdException w:name="Grid Table 5 Dark Accent 4" w:uiPriority="50"/>
-    <w:lsdException w:name="Grid Table 6 Colorful Accent 4" w:uiPriority="51"/>
-    <w:lsdException w:name="Grid Table 7 Colorful Accent 4" w:uiPriority="52"/>
-    <w:lsdException w:name="Grid Table 1 Light Accent 5" w:uiPriority="46"/>
-    <w:lsdException w:name="Grid Table 2 Accent 5" w:uiPriority="47"/>
-    <w:lsdException w:name="Grid Table 3 Accent 5" w:uiPriority="48"/>
-    <w:lsdException w:name="Grid Table 4 Accent 5" w:uiPriority="49"/>
-    <w:lsdException w:name="Grid Table 5 Dark Accent 5" w:uiPriority="50"/>
-    <w:lsdException w:name="Grid Table 6 Colorful Accent 5" w:uiPriority="51"/>
-    <w:lsdException w:name="Grid Table 7 Colorful Accent 5" w:uiPriority="52"/>
-    <w:lsdException w:name="Grid Table 1 Light Accent 6" w:uiPriority="46"/>
-    <w:lsdException w:name="Grid Table 2 Accent 6" w:uiPriority="47"/>
-    <w:lsdException w:name="Grid Table 3 Accent 6" w:uiPriority="48"/>
-    <w:lsdException w:name="Grid Table 4 Accent 6" w:uiPriority="49"/>
-    <w:lsdException w:name="Grid Table 5 Dark Accent 6" w:uiPriority="50"/>
-    <w:lsdException w:name="Grid Table 6 Colorful Accent 6" w:uiPriority="51"/>
-    <w:lsdException w:name="Grid Table 7 Colorful Accent 6" w:uiPriority="52"/>
-    <w:lsdException w:name="List Table 1 Light" w:uiPriority="46"/>
-    <w:lsdException w:name="List Table 2" w:uiPriority="47"/>
-    <w:lsdException w:name="List Table 3" w:uiPriority="48"/>
-    <w:lsdException w:name="List Table 4" w:uiPriority="49"/>
-    <w:lsdException w:name="List Table 5 Dark" w:uiPriority="50"/>
-    <w:lsdException w:name="List Table 6 Colorful" w:uiPriority="51"/>
-    <w:lsdException w:name="List Table 7 Colorful" w:uiPriority="52"/>
-    <w:lsdException w:name="List Table 1 Light Accent 1" w:uiPriority="46"/>
-    <w:lsdException w:name="List Table 2 Accent 1" w:uiPriority="47"/>
-    <w:lsdException w:name="List Table 3 Accent 1" w:uiPriority="48"/>
-    <w:lsdException w:name="List Table 4 Accent 1" w:uiPriority="49"/>
-    <w:lsdException w:name="List Table 5 Dark Accent 1" w:uiPriority="50"/>
-    <w:lsdException w:name="List Table 6 Colorful Accent 1" w:uiPriority="51"/>
-    <w:lsdException w:name="List Table 7 Colorful Accent 1" w:uiPriority="52"/>
-    <w:lsdException w:name="List Table 1 Light Accent 2" w:uiPriority="46"/>
-    <w:lsdException w:name="List Table 2 Accent 2" w:uiPriority="47"/>
-    <w:lsdException w:name="List Table 3 Accent 2" w:uiPriority="48"/>
-    <w:lsdException w:name="List Table 4 Accent 2" w:uiPriority="49"/>
-    <w:lsdException w:name="List Table 5 Dark Accent 2" w:uiPriority="50"/>
-    <w:lsdException w:name="List Table 6 Colorful Accent 2" w:uiPriority="51"/>
-    <w:lsdException w:name="List Table 7 Colorful Accent 2" w:uiPriority="52"/>
-    <w:lsdException w:name="List Table 1 Light Accent 3" w:uiPriority="46"/>
-    <w:lsdException w:name="List Table 2 Accent 3" w:uiPriority="47"/>
-    <w:lsdException w:name="List Table 3 Accent 3" w:uiPriority="48"/>
-    <w:lsdException w:name="List Table 4 Accent 3" w:uiPriority="49"/>
-    <w:lsdException w:name="List Table 5 Dark Accent 3" w:uiPriority="50"/>
-    <w:lsdException w:name="List Table 6 Colorful Accent 3" w:uiPriority="51"/>
-    <w:lsdException w:name="List Table 7 Colorful Accent 3" w:uiPriority="52"/>
-    <w:lsdException w:name="List Table 1 Light Accent 4" w:uiPriority="46"/>
-    <w:lsdException w:name="List Table 2 Accent 4" w:uiPriority="47"/>
-    <w:lsdException w:name="List Table 3 Accent 4" w:uiPriority="48"/>
-    <w:lsdException w:name="List Table 4 Accent 4" w:uiPriority="49"/>
-    <w:lsdException w:name="List Table 5 Dark Accent 4" w:uiPriority="50"/>
-    <w:lsdException w:name="List Table 6 Colorful Accent 4" w:uiPriority="51"/>
-    <w:lsdException w:name="List Table 7 Colorful Accent 4" w:uiPriority="52"/>
-    <w:lsdException w:name="List Table 1 Light Accent 5" w:uiPriority="46"/>
-    <w:lsdException w:name="List Table 2 Accent 5" w:uiPriority="47"/>
-    <w:lsdException w:name="List Table 3 Accent 5" w:uiPriority="48"/>
-    <w:lsdException w:name="List Table 4 Accent 5" w:uiPriority="49"/>
-    <w:lsdException w:name="List Table 5 Dark Accent 5" w:uiPriority="50"/>
-    <w:lsdException w:name="List Table 6 Colorful Accent 5" w:uiPriority="51"/>
-    <w:lsdException w:name="List Table 7 Colorful Accent 5" w:uiPriority="52"/>
-    <w:lsdException w:name="List Table 1 Light Accent 6" w:uiPriority="46"/>
-    <w:lsdException w:name="List Table 2 Accent 6" w:uiPriority="47"/>
-    <w:lsdException w:name="List Table 3 Accent 6" w:uiPriority="48"/>
-    <w:lsdException w:name="List Table 4 Accent 6" w:uiPriority="49"/>
-    <w:lsdException w:name="List Table 5 Dark Accent 6" w:uiPriority="50"/>
-    <w:lsdException w:name="List Table 6 Colorful Accent 6" w:uiPriority="51"/>
-    <w:lsdException w:name="List Table 7 Colorful Accent 6" w:uiPriority="52"/>
-    <w:lsdException w:name="Mention" w:semiHidden="1" w:unhideWhenUsed="1"/>
-    <w:lsdException w:name="Smart Hyperlink" w:semiHidden="1" w:unhideWhenUsed="1"/>
-    <w:lsdException w:name="Hashtag" w:semiHidden="1" w:unhideWhenUsed="1"/>
-    <w:lsdException w:name="Unresolved Mention" w:semiHidden="1" w:unhideWhenUsed="1"/>
-    <w:lsdException w:name="Smart Link" w:semiHidden="1" w:unhideWhenUsed="1"/>
-  </w:latentStyles>
-  <w:style w:type="paragraph" w:default="1" w:styleId="Normal">
-    <w:name w:val="Normal"/>
-    <w:qFormat/>
-  </w:style>
-  <w:style w:type="character" w:default="1" w:styleId="DefaultParagraphFont">
-    <w:name w:val="Default Paragraph Font"/>
-    <w:uiPriority w:val="1"/>
-    <w:semiHidden/>
-    <w:unhideWhenUsed/>
-  </w:style>
-  <w:style w:type="table" w:default="1" w:styleId="TableNormal">
-    <w:name w:val="Normal Table"/>
-    <w:uiPriority w:val="99"/>
-    <w:semiHidden/>
-    <w:unhideWhenUsed/>
-    <w:tblPr>
-      <w:tblInd w:w="0" w:type="dxa"/>
-      <w:tblCellMar>
-        <w:top w:w="0" w:type="dxa"/>
-        <w:left w:w="108" w:type="dxa"/>
-        <w:bottom w:w="0" w:type="dxa"/>
-        <w:right w:w="108" w:type="dxa"/>
-      </w:tblCellMar>
-    </w:tblPr>
-  </w:style>
-  <w:style w:type="numbering" w:default="1" w:styleId="NoList">
-    <w:name w:val="No List"/>
-    <w:uiPriority w:val="99"/>
-    <w:semiHidden/>
-    <w:unhideWhenUsed/>
-  </w:style>
-  <w:style w:type="character" w:styleId="PlaceholderText">
-    <w:name w:val="Placeholder Text"/>
-    <w:basedOn w:val="DefaultParagraphFont"/>
-    <w:uiPriority w:val="99"/>
-    <w:semiHidden/>
-    <w:rsid w:val="00291FBF"/>
-    <w:rPr>
-      <w:color w:val="666666"/>
-    </w:rPr>
-  </w:style>
-  <w:style w:type="paragraph" w:customStyle="1" w:styleId="E3A57DEBF961414EA5CDC766D764A65E">
-    <w:name w:val="E3A57DEBF961414EA5CDC766D764A65E"/>
-    <w:rsid w:val="00D446F0"/>
-  </w:style>
-</w:styles>
-</file>
-
-<file path=word/glossary/webSettings.xml><?xml version="1.0" encoding="utf-8"?>
-<w:webSettings xmlns:mc="http://schemas.openxmlformats.org/markup-compatibility/2006" xmlns:r="http://schemas.openxmlformats.org/officeDocument/2006/relationships" xmlns:w="http://schemas.openxmlformats.org/wordprocessingml/2006/main" xmlns:w14="http://schemas.microsoft.com/office/word/2010/wordml" xmlns:w15="http://schemas.microsoft.com/office/word/2012/wordml" xmlns:w16cex="http://schemas.microsoft.com/office/word/2018/wordml/cex" xmlns:w16cid="http://schemas.microsoft.com/office/word/2016/wordml/cid" xmlns:w16="http://schemas.microsoft.com/office/word/2018/wordml" xmlns:w16sdtdh="http://schemas.microsoft.com/office/word/2020/wordml/sdtdatahash" xmlns:w16sdtfl="http://schemas.microsoft.com/office/word/2024/wordml/sdtformatlock" xmlns:w16se="http://schemas.microsoft.com/office/word/2015/wordml/symex" xmlns:w16du="http://schemas.microsoft.com/office/word/2023/wordml/word16du" mc:Ignorable="w14 w15 w16se w16cid w16 w16cex w16sdtdh w16sdtfl w16du">
-  <w:optimizeForBrowser/>
-  <w:allowPNG/>
-</w:webSettings>
 </file>
 
 <file path=word/theme/theme1.xml><?xml version="1.0" encoding="utf-8"?>

</xml_diff>